<commit_message>
Use letter categories only (أ/ب/ج) in diagnostic grid
Co-Authored-By: Claude Opus 5.5 <noreply@anthropic.com>
Claude-Session: https://claude.ai/code/session_0191GkvowkQwD7tFy4wy6pBY
</commit_message>
<xml_diff>
--- a/شبكة-التشخيصي-رياضيات-السابع-نور.docx
+++ b/شبكة-التشخيصي-رياضيات-السابع-نور.docx
@@ -2129,297 +2129,321 @@
                 <w:szCs w:val="24"/>
                 <w:rtl w:val="1"/>
               </w:rPr>
-              <w:t xml:space="preserve">العلامة القصوى</w:t>
-            </w:r>
-          </w:p>
-        </w:tc>
-        <w:tc>
-          <w:tcPr>
-            <w:tcBorders>
-              <w:top w:color="808080" w:space="0" w:sz="4" w:val="single"/>
-              <w:left w:color="808080" w:space="0" w:sz="4" w:val="single"/>
-              <w:bottom w:color="808080" w:space="0" w:sz="4" w:val="single"/>
-              <w:right w:color="808080" w:space="0" w:sz="4" w:val="single"/>
-            </w:tcBorders>
-            <w:tcMar>
-              <w:top w:w="60.0" w:type="dxa"/>
-              <w:bottom w:w="60.0" w:type="dxa"/>
-            </w:tcMar>
-            <w:vAlign w:val="center"/>
-          </w:tcPr>
-          <w:p>
-            <w:pPr>
-              <w:jc w:val="center"/>
-              <w:rPr>
-                <w:sz w:val="24"/>
-                <w:szCs w:val="24"/>
-              </w:rPr>
-            </w:pPr>
-            <w:r>
-              <w:rPr>
-                <w:sz w:val="24"/>
-                <w:szCs w:val="24"/>
-                <w:rtl w:val="1"/>
-              </w:rPr>
-              <w:t xml:space="preserve">3.5</w:t>
-            </w:r>
-          </w:p>
-        </w:tc>
-        <w:tc>
-          <w:tcPr>
-            <w:tcBorders>
-              <w:top w:color="808080" w:space="0" w:sz="4" w:val="single"/>
-              <w:left w:color="808080" w:space="0" w:sz="4" w:val="single"/>
-              <w:bottom w:color="808080" w:space="0" w:sz="4" w:val="single"/>
-              <w:right w:color="808080" w:space="0" w:sz="4" w:val="single"/>
-            </w:tcBorders>
-            <w:tcMar>
-              <w:top w:w="60.0" w:type="dxa"/>
-              <w:bottom w:w="60.0" w:type="dxa"/>
-            </w:tcMar>
-            <w:vAlign w:val="center"/>
-          </w:tcPr>
-          <w:p>
-            <w:pPr>
-              <w:jc w:val="center"/>
-              <w:rPr>
-                <w:sz w:val="24"/>
-                <w:szCs w:val="24"/>
-              </w:rPr>
-            </w:pPr>
-            <w:r>
-              <w:rPr>
-                <w:sz w:val="24"/>
-                <w:szCs w:val="24"/>
-                <w:rtl w:val="1"/>
-              </w:rPr>
-              <w:t xml:space="preserve">3</w:t>
-            </w:r>
-          </w:p>
-        </w:tc>
-        <w:tc>
-          <w:tcPr>
-            <w:tcBorders>
-              <w:top w:color="808080" w:space="0" w:sz="4" w:val="single"/>
-              <w:left w:color="808080" w:space="0" w:sz="4" w:val="single"/>
-              <w:bottom w:color="808080" w:space="0" w:sz="4" w:val="single"/>
-              <w:right w:color="808080" w:space="0" w:sz="4" w:val="single"/>
-            </w:tcBorders>
-            <w:tcMar>
-              <w:top w:w="60.0" w:type="dxa"/>
-              <w:bottom w:w="60.0" w:type="dxa"/>
-            </w:tcMar>
-            <w:vAlign w:val="center"/>
-          </w:tcPr>
-          <w:p>
-            <w:pPr>
-              <w:jc w:val="center"/>
-              <w:rPr>
-                <w:sz w:val="24"/>
-                <w:szCs w:val="24"/>
-              </w:rPr>
-            </w:pPr>
-            <w:r>
-              <w:rPr>
-                <w:sz w:val="24"/>
-                <w:szCs w:val="24"/>
-                <w:rtl w:val="1"/>
-              </w:rPr>
-              <w:t xml:space="preserve">1.5</w:t>
-            </w:r>
-          </w:p>
-        </w:tc>
-        <w:tc>
-          <w:tcPr>
-            <w:tcBorders>
-              <w:top w:color="808080" w:space="0" w:sz="4" w:val="single"/>
-              <w:left w:color="808080" w:space="0" w:sz="4" w:val="single"/>
-              <w:bottom w:color="808080" w:space="0" w:sz="4" w:val="single"/>
-              <w:right w:color="808080" w:space="0" w:sz="4" w:val="single"/>
-            </w:tcBorders>
-            <w:tcMar>
-              <w:top w:w="60.0" w:type="dxa"/>
-              <w:bottom w:w="60.0" w:type="dxa"/>
-            </w:tcMar>
-            <w:vAlign w:val="center"/>
-          </w:tcPr>
-          <w:p>
-            <w:pPr>
-              <w:jc w:val="center"/>
-              <w:rPr>
-                <w:sz w:val="24"/>
-                <w:szCs w:val="24"/>
-              </w:rPr>
-            </w:pPr>
-            <w:r>
-              <w:rPr>
-                <w:sz w:val="24"/>
-                <w:szCs w:val="24"/>
-                <w:rtl w:val="1"/>
-              </w:rPr>
-              <w:t xml:space="preserve">2</w:t>
-            </w:r>
-          </w:p>
-        </w:tc>
-        <w:tc>
-          <w:tcPr>
-            <w:tcBorders>
-              <w:top w:color="808080" w:space="0" w:sz="4" w:val="single"/>
-              <w:left w:color="808080" w:space="0" w:sz="4" w:val="single"/>
-              <w:bottom w:color="808080" w:space="0" w:sz="4" w:val="single"/>
-              <w:right w:color="808080" w:space="0" w:sz="4" w:val="single"/>
-            </w:tcBorders>
-            <w:tcMar>
-              <w:top w:w="60.0" w:type="dxa"/>
-              <w:bottom w:w="60.0" w:type="dxa"/>
-            </w:tcMar>
-            <w:vAlign w:val="center"/>
-          </w:tcPr>
-          <w:p>
-            <w:pPr>
-              <w:jc w:val="center"/>
-              <w:rPr>
-                <w:sz w:val="24"/>
-                <w:szCs w:val="24"/>
-              </w:rPr>
-            </w:pPr>
-            <w:r>
-              <w:rPr>
-                <w:sz w:val="24"/>
-                <w:szCs w:val="24"/>
-                <w:rtl w:val="1"/>
-              </w:rPr>
-              <w:t xml:space="preserve">1</w:t>
-            </w:r>
-          </w:p>
-        </w:tc>
-        <w:tc>
-          <w:tcPr>
-            <w:tcBorders>
-              <w:top w:color="808080" w:space="0" w:sz="4" w:val="single"/>
-              <w:left w:color="808080" w:space="0" w:sz="4" w:val="single"/>
-              <w:bottom w:color="808080" w:space="0" w:sz="4" w:val="single"/>
-              <w:right w:color="808080" w:space="0" w:sz="4" w:val="single"/>
-            </w:tcBorders>
-            <w:tcMar>
-              <w:top w:w="60.0" w:type="dxa"/>
-              <w:bottom w:w="60.0" w:type="dxa"/>
-            </w:tcMar>
-            <w:vAlign w:val="center"/>
-          </w:tcPr>
-          <w:p>
-            <w:pPr>
-              <w:jc w:val="center"/>
-              <w:rPr>
-                <w:sz w:val="24"/>
-                <w:szCs w:val="24"/>
-              </w:rPr>
-            </w:pPr>
-            <w:r>
-              <w:rPr>
-                <w:sz w:val="24"/>
-                <w:szCs w:val="24"/>
-                <w:rtl w:val="1"/>
-              </w:rPr>
-              <w:t xml:space="preserve">2</w:t>
-            </w:r>
-          </w:p>
-        </w:tc>
-        <w:tc>
-          <w:tcPr>
-            <w:tcBorders>
-              <w:top w:color="808080" w:space="0" w:sz="4" w:val="single"/>
-              <w:left w:color="808080" w:space="0" w:sz="4" w:val="single"/>
-              <w:bottom w:color="808080" w:space="0" w:sz="4" w:val="single"/>
-              <w:right w:color="808080" w:space="0" w:sz="4" w:val="single"/>
-            </w:tcBorders>
-            <w:tcMar>
-              <w:top w:w="60.0" w:type="dxa"/>
-              <w:bottom w:w="60.0" w:type="dxa"/>
-            </w:tcMar>
-            <w:vAlign w:val="center"/>
-          </w:tcPr>
-          <w:p>
-            <w:pPr>
-              <w:jc w:val="center"/>
-              <w:rPr>
-                <w:sz w:val="24"/>
-                <w:szCs w:val="24"/>
-              </w:rPr>
-            </w:pPr>
-            <w:r>
-              <w:rPr>
-                <w:sz w:val="24"/>
-                <w:szCs w:val="24"/>
-                <w:rtl w:val="1"/>
-              </w:rPr>
-              <w:t xml:space="preserve">2</w:t>
-            </w:r>
-          </w:p>
-        </w:tc>
-        <w:tc>
-          <w:tcPr>
-            <w:tcBorders>
-              <w:top w:color="808080" w:space="0" w:sz="4" w:val="single"/>
-              <w:left w:color="808080" w:space="0" w:sz="4" w:val="single"/>
-              <w:bottom w:color="808080" w:space="0" w:sz="4" w:val="single"/>
-              <w:right w:color="808080" w:space="0" w:sz="4" w:val="single"/>
-            </w:tcBorders>
-            <w:tcMar>
-              <w:top w:w="60.0" w:type="dxa"/>
-              <w:bottom w:w="60.0" w:type="dxa"/>
-            </w:tcMar>
-            <w:vAlign w:val="center"/>
-          </w:tcPr>
-          <w:p>
-            <w:pPr>
-              <w:jc w:val="center"/>
-              <w:rPr>
-                <w:sz w:val="24"/>
-                <w:szCs w:val="24"/>
-              </w:rPr>
-            </w:pPr>
-            <w:r>
-              <w:rPr>
-                <w:sz w:val="24"/>
-                <w:szCs w:val="24"/>
-                <w:rtl w:val="1"/>
-              </w:rPr>
-              <w:t xml:space="preserve">5</w:t>
-            </w:r>
-          </w:p>
-        </w:tc>
-        <w:tc>
-          <w:tcPr>
-            <w:tcBorders>
-              <w:top w:color="808080" w:space="0" w:sz="4" w:val="single"/>
-              <w:left w:color="808080" w:space="0" w:sz="4" w:val="single"/>
-              <w:bottom w:color="808080" w:space="0" w:sz="4" w:val="single"/>
-              <w:right w:color="808080" w:space="0" w:sz="4" w:val="single"/>
-            </w:tcBorders>
-            <w:tcMar>
-              <w:top w:w="60.0" w:type="dxa"/>
-              <w:bottom w:w="60.0" w:type="dxa"/>
-            </w:tcMar>
-            <w:vAlign w:val="center"/>
-          </w:tcPr>
-          <w:p>
-            <w:pPr>
-              <w:jc w:val="center"/>
-              <w:rPr>
-                <w:sz w:val="24"/>
-                <w:szCs w:val="24"/>
-              </w:rPr>
-            </w:pPr>
-            <w:r>
-              <w:rPr>
-                <w:b w:val="1"/>
-                <w:bCs w:val="1"/>
-                <w:sz w:val="24"/>
-                <w:szCs w:val="24"/>
-                <w:rtl w:val="1"/>
-              </w:rPr>
-              <w:t xml:space="preserve">20</w:t>
+              <w:t xml:space="preserve">احمد بصل</w:t>
+            </w:r>
+          </w:p>
+        </w:tc>
+        <w:tc>
+          <w:tcPr>
+            <w:tcBorders>
+              <w:top w:color="808080" w:space="0" w:sz="4" w:val="single"/>
+              <w:left w:color="808080" w:space="0" w:sz="4" w:val="single"/>
+              <w:bottom w:color="808080" w:space="0" w:sz="4" w:val="single"/>
+              <w:right w:color="808080" w:space="0" w:sz="4" w:val="single"/>
+            </w:tcBorders>
+            <w:shd w:val="clear" w:color="auto" w:fill="D9EAD3"/>
+            <w:tcMar>
+              <w:top w:w="60.0" w:type="dxa"/>
+              <w:bottom w:w="60.0" w:type="dxa"/>
+            </w:tcMar>
+            <w:vAlign w:val="center"/>
+          </w:tcPr>
+          <w:p>
+            <w:pPr>
+              <w:jc w:val="center"/>
+              <w:rPr>
+                <w:sz w:val="24"/>
+                <w:szCs w:val="24"/>
+              </w:rPr>
+            </w:pPr>
+            <w:r>
+              <w:rPr>
+                <w:b w:val="1"/>
+                <w:bCs w:val="1"/>
+                <w:sz w:val="24"/>
+                <w:szCs w:val="24"/>
+                <w:rtl w:val="1"/>
+              </w:rPr>
+              <w:t xml:space="preserve">أ</w:t>
+            </w:r>
+          </w:p>
+        </w:tc>
+        <w:tc>
+          <w:tcPr>
+            <w:tcBorders>
+              <w:top w:color="808080" w:space="0" w:sz="4" w:val="single"/>
+              <w:left w:color="808080" w:space="0" w:sz="4" w:val="single"/>
+              <w:bottom w:color="808080" w:space="0" w:sz="4" w:val="single"/>
+              <w:right w:color="808080" w:space="0" w:sz="4" w:val="single"/>
+            </w:tcBorders>
+            <w:shd w:val="clear" w:color="auto" w:fill="D9EAD3"/>
+            <w:tcMar>
+              <w:top w:w="60.0" w:type="dxa"/>
+              <w:bottom w:w="60.0" w:type="dxa"/>
+            </w:tcMar>
+            <w:vAlign w:val="center"/>
+          </w:tcPr>
+          <w:p>
+            <w:pPr>
+              <w:jc w:val="center"/>
+              <w:rPr>
+                <w:sz w:val="24"/>
+                <w:szCs w:val="24"/>
+              </w:rPr>
+            </w:pPr>
+            <w:r>
+              <w:rPr>
+                <w:b w:val="1"/>
+                <w:bCs w:val="1"/>
+                <w:sz w:val="24"/>
+                <w:szCs w:val="24"/>
+                <w:rtl w:val="1"/>
+              </w:rPr>
+              <w:t xml:space="preserve">أ</w:t>
+            </w:r>
+          </w:p>
+        </w:tc>
+        <w:tc>
+          <w:tcPr>
+            <w:tcBorders>
+              <w:top w:color="808080" w:space="0" w:sz="4" w:val="single"/>
+              <w:left w:color="808080" w:space="0" w:sz="4" w:val="single"/>
+              <w:bottom w:color="808080" w:space="0" w:sz="4" w:val="single"/>
+              <w:right w:color="808080" w:space="0" w:sz="4" w:val="single"/>
+            </w:tcBorders>
+            <w:shd w:val="clear" w:color="auto" w:fill="D9EAD3"/>
+            <w:tcMar>
+              <w:top w:w="60.0" w:type="dxa"/>
+              <w:bottom w:w="60.0" w:type="dxa"/>
+            </w:tcMar>
+            <w:vAlign w:val="center"/>
+          </w:tcPr>
+          <w:p>
+            <w:pPr>
+              <w:jc w:val="center"/>
+              <w:rPr>
+                <w:sz w:val="24"/>
+                <w:szCs w:val="24"/>
+              </w:rPr>
+            </w:pPr>
+            <w:r>
+              <w:rPr>
+                <w:b w:val="1"/>
+                <w:bCs w:val="1"/>
+                <w:sz w:val="24"/>
+                <w:szCs w:val="24"/>
+                <w:rtl w:val="1"/>
+              </w:rPr>
+              <w:t xml:space="preserve">أ</w:t>
+            </w:r>
+          </w:p>
+        </w:tc>
+        <w:tc>
+          <w:tcPr>
+            <w:tcBorders>
+              <w:top w:color="808080" w:space="0" w:sz="4" w:val="single"/>
+              <w:left w:color="808080" w:space="0" w:sz="4" w:val="single"/>
+              <w:bottom w:color="808080" w:space="0" w:sz="4" w:val="single"/>
+              <w:right w:color="808080" w:space="0" w:sz="4" w:val="single"/>
+            </w:tcBorders>
+            <w:shd w:val="clear" w:color="auto" w:fill="D9EAD3"/>
+            <w:tcMar>
+              <w:top w:w="60.0" w:type="dxa"/>
+              <w:bottom w:w="60.0" w:type="dxa"/>
+            </w:tcMar>
+            <w:vAlign w:val="center"/>
+          </w:tcPr>
+          <w:p>
+            <w:pPr>
+              <w:jc w:val="center"/>
+              <w:rPr>
+                <w:sz w:val="24"/>
+                <w:szCs w:val="24"/>
+              </w:rPr>
+            </w:pPr>
+            <w:r>
+              <w:rPr>
+                <w:b w:val="1"/>
+                <w:bCs w:val="1"/>
+                <w:sz w:val="24"/>
+                <w:szCs w:val="24"/>
+                <w:rtl w:val="1"/>
+              </w:rPr>
+              <w:t xml:space="preserve">أ</w:t>
+            </w:r>
+          </w:p>
+        </w:tc>
+        <w:tc>
+          <w:tcPr>
+            <w:tcBorders>
+              <w:top w:color="808080" w:space="0" w:sz="4" w:val="single"/>
+              <w:left w:color="808080" w:space="0" w:sz="4" w:val="single"/>
+              <w:bottom w:color="808080" w:space="0" w:sz="4" w:val="single"/>
+              <w:right w:color="808080" w:space="0" w:sz="4" w:val="single"/>
+            </w:tcBorders>
+            <w:shd w:val="clear" w:color="auto" w:fill="D9EAD3"/>
+            <w:tcMar>
+              <w:top w:w="60.0" w:type="dxa"/>
+              <w:bottom w:w="60.0" w:type="dxa"/>
+            </w:tcMar>
+            <w:vAlign w:val="center"/>
+          </w:tcPr>
+          <w:p>
+            <w:pPr>
+              <w:jc w:val="center"/>
+              <w:rPr>
+                <w:sz w:val="24"/>
+                <w:szCs w:val="24"/>
+              </w:rPr>
+            </w:pPr>
+            <w:r>
+              <w:rPr>
+                <w:b w:val="1"/>
+                <w:bCs w:val="1"/>
+                <w:sz w:val="24"/>
+                <w:szCs w:val="24"/>
+                <w:rtl w:val="1"/>
+              </w:rPr>
+              <w:t xml:space="preserve">أ</w:t>
+            </w:r>
+          </w:p>
+        </w:tc>
+        <w:tc>
+          <w:tcPr>
+            <w:tcBorders>
+              <w:top w:color="808080" w:space="0" w:sz="4" w:val="single"/>
+              <w:left w:color="808080" w:space="0" w:sz="4" w:val="single"/>
+              <w:bottom w:color="808080" w:space="0" w:sz="4" w:val="single"/>
+              <w:right w:color="808080" w:space="0" w:sz="4" w:val="single"/>
+            </w:tcBorders>
+            <w:shd w:val="clear" w:color="auto" w:fill="FFF2CC"/>
+            <w:tcMar>
+              <w:top w:w="60.0" w:type="dxa"/>
+              <w:bottom w:w="60.0" w:type="dxa"/>
+            </w:tcMar>
+            <w:vAlign w:val="center"/>
+          </w:tcPr>
+          <w:p>
+            <w:pPr>
+              <w:jc w:val="center"/>
+              <w:rPr>
+                <w:sz w:val="24"/>
+                <w:szCs w:val="24"/>
+              </w:rPr>
+            </w:pPr>
+            <w:r>
+              <w:rPr>
+                <w:b w:val="1"/>
+                <w:bCs w:val="1"/>
+                <w:sz w:val="24"/>
+                <w:szCs w:val="24"/>
+                <w:rtl w:val="1"/>
+              </w:rPr>
+              <w:t xml:space="preserve">ب</w:t>
+            </w:r>
+          </w:p>
+        </w:tc>
+        <w:tc>
+          <w:tcPr>
+            <w:tcBorders>
+              <w:top w:color="808080" w:space="0" w:sz="4" w:val="single"/>
+              <w:left w:color="808080" w:space="0" w:sz="4" w:val="single"/>
+              <w:bottom w:color="808080" w:space="0" w:sz="4" w:val="single"/>
+              <w:right w:color="808080" w:space="0" w:sz="4" w:val="single"/>
+            </w:tcBorders>
+            <w:shd w:val="clear" w:color="auto" w:fill="D9EAD3"/>
+            <w:tcMar>
+              <w:top w:w="60.0" w:type="dxa"/>
+              <w:bottom w:w="60.0" w:type="dxa"/>
+            </w:tcMar>
+            <w:vAlign w:val="center"/>
+          </w:tcPr>
+          <w:p>
+            <w:pPr>
+              <w:jc w:val="center"/>
+              <w:rPr>
+                <w:sz w:val="24"/>
+                <w:szCs w:val="24"/>
+              </w:rPr>
+            </w:pPr>
+            <w:r>
+              <w:rPr>
+                <w:b w:val="1"/>
+                <w:bCs w:val="1"/>
+                <w:sz w:val="24"/>
+                <w:szCs w:val="24"/>
+                <w:rtl w:val="1"/>
+              </w:rPr>
+              <w:t xml:space="preserve">أ</w:t>
+            </w:r>
+          </w:p>
+        </w:tc>
+        <w:tc>
+          <w:tcPr>
+            <w:tcBorders>
+              <w:top w:color="808080" w:space="0" w:sz="4" w:val="single"/>
+              <w:left w:color="808080" w:space="0" w:sz="4" w:val="single"/>
+              <w:bottom w:color="808080" w:space="0" w:sz="4" w:val="single"/>
+              <w:right w:color="808080" w:space="0" w:sz="4" w:val="single"/>
+            </w:tcBorders>
+            <w:shd w:val="clear" w:color="auto" w:fill="D9EAD3"/>
+            <w:tcMar>
+              <w:top w:w="60.0" w:type="dxa"/>
+              <w:bottom w:w="60.0" w:type="dxa"/>
+            </w:tcMar>
+            <w:vAlign w:val="center"/>
+          </w:tcPr>
+          <w:p>
+            <w:pPr>
+              <w:jc w:val="center"/>
+              <w:rPr>
+                <w:sz w:val="24"/>
+                <w:szCs w:val="24"/>
+              </w:rPr>
+            </w:pPr>
+            <w:r>
+              <w:rPr>
+                <w:b w:val="1"/>
+                <w:bCs w:val="1"/>
+                <w:sz w:val="24"/>
+                <w:szCs w:val="24"/>
+                <w:rtl w:val="1"/>
+              </w:rPr>
+              <w:t xml:space="preserve">أ</w:t>
+            </w:r>
+          </w:p>
+        </w:tc>
+        <w:tc>
+          <w:tcPr>
+            <w:tcBorders>
+              <w:top w:color="808080" w:space="0" w:sz="4" w:val="single"/>
+              <w:left w:color="808080" w:space="0" w:sz="4" w:val="single"/>
+              <w:bottom w:color="808080" w:space="0" w:sz="4" w:val="single"/>
+              <w:right w:color="808080" w:space="0" w:sz="4" w:val="single"/>
+            </w:tcBorders>
+            <w:tcMar>
+              <w:top w:w="60.0" w:type="dxa"/>
+              <w:bottom w:w="60.0" w:type="dxa"/>
+            </w:tcMar>
+            <w:vAlign w:val="center"/>
+          </w:tcPr>
+          <w:p>
+            <w:pPr>
+              <w:jc w:val="center"/>
+              <w:rPr>
+                <w:sz w:val="24"/>
+                <w:szCs w:val="24"/>
+              </w:rPr>
+            </w:pPr>
+            <w:r>
+              <w:rPr>
+                <w:b w:val="1"/>
+                <w:bCs w:val="1"/>
+                <w:sz w:val="24"/>
+                <w:szCs w:val="24"/>
+                <w:rtl w:val="1"/>
+              </w:rPr>
+              <w:t xml:space="preserve">19</w:t>
             </w:r>
           </w:p>
         </w:tc>
@@ -2459,7 +2483,7 @@
                 <w:szCs w:val="24"/>
                 <w:rtl w:val="1"/>
               </w:rPr>
-              <w:t xml:space="preserve">احمد بصل</w:t>
+              <w:t xml:space="preserve">ابراهيم صيدح</w:t>
             </w:r>
           </w:p>
         </w:tc>
@@ -2506,6 +2530,41 @@
               <w:bottom w:color="808080" w:space="0" w:sz="4" w:val="single"/>
               <w:right w:color="808080" w:space="0" w:sz="4" w:val="single"/>
             </w:tcBorders>
+            <w:shd w:val="clear" w:color="auto" w:fill="FFF2CC"/>
+            <w:tcMar>
+              <w:top w:w="60.0" w:type="dxa"/>
+              <w:bottom w:w="60.0" w:type="dxa"/>
+            </w:tcMar>
+            <w:vAlign w:val="center"/>
+          </w:tcPr>
+          <w:p>
+            <w:pPr>
+              <w:jc w:val="center"/>
+              <w:rPr>
+                <w:sz w:val="24"/>
+                <w:szCs w:val="24"/>
+              </w:rPr>
+            </w:pPr>
+            <w:r>
+              <w:rPr>
+                <w:b w:val="1"/>
+                <w:bCs w:val="1"/>
+                <w:sz w:val="24"/>
+                <w:szCs w:val="24"/>
+                <w:rtl w:val="1"/>
+              </w:rPr>
+              <w:t xml:space="preserve">ب</w:t>
+            </w:r>
+          </w:p>
+        </w:tc>
+        <w:tc>
+          <w:tcPr>
+            <w:tcBorders>
+              <w:top w:color="808080" w:space="0" w:sz="4" w:val="single"/>
+              <w:left w:color="808080" w:space="0" w:sz="4" w:val="single"/>
+              <w:bottom w:color="808080" w:space="0" w:sz="4" w:val="single"/>
+              <w:right w:color="808080" w:space="0" w:sz="4" w:val="single"/>
+            </w:tcBorders>
             <w:shd w:val="clear" w:color="auto" w:fill="D9EAD3"/>
             <w:tcMar>
               <w:top w:w="60.0" w:type="dxa"/>
@@ -2541,6 +2600,41 @@
               <w:bottom w:color="808080" w:space="0" w:sz="4" w:val="single"/>
               <w:right w:color="808080" w:space="0" w:sz="4" w:val="single"/>
             </w:tcBorders>
+            <w:shd w:val="clear" w:color="auto" w:fill="FFF2CC"/>
+            <w:tcMar>
+              <w:top w:w="60.0" w:type="dxa"/>
+              <w:bottom w:w="60.0" w:type="dxa"/>
+            </w:tcMar>
+            <w:vAlign w:val="center"/>
+          </w:tcPr>
+          <w:p>
+            <w:pPr>
+              <w:jc w:val="center"/>
+              <w:rPr>
+                <w:sz w:val="24"/>
+                <w:szCs w:val="24"/>
+              </w:rPr>
+            </w:pPr>
+            <w:r>
+              <w:rPr>
+                <w:b w:val="1"/>
+                <w:bCs w:val="1"/>
+                <w:sz w:val="24"/>
+                <w:szCs w:val="24"/>
+                <w:rtl w:val="1"/>
+              </w:rPr>
+              <w:t xml:space="preserve">ب</w:t>
+            </w:r>
+          </w:p>
+        </w:tc>
+        <w:tc>
+          <w:tcPr>
+            <w:tcBorders>
+              <w:top w:color="808080" w:space="0" w:sz="4" w:val="single"/>
+              <w:left w:color="808080" w:space="0" w:sz="4" w:val="single"/>
+              <w:bottom w:color="808080" w:space="0" w:sz="4" w:val="single"/>
+              <w:right w:color="808080" w:space="0" w:sz="4" w:val="single"/>
+            </w:tcBorders>
             <w:shd w:val="clear" w:color="auto" w:fill="D9EAD3"/>
             <w:tcMar>
               <w:top w:w="60.0" w:type="dxa"/>
@@ -2576,6 +2670,41 @@
               <w:bottom w:color="808080" w:space="0" w:sz="4" w:val="single"/>
               <w:right w:color="808080" w:space="0" w:sz="4" w:val="single"/>
             </w:tcBorders>
+            <w:shd w:val="clear" w:color="auto" w:fill="FFF2CC"/>
+            <w:tcMar>
+              <w:top w:w="60.0" w:type="dxa"/>
+              <w:bottom w:w="60.0" w:type="dxa"/>
+            </w:tcMar>
+            <w:vAlign w:val="center"/>
+          </w:tcPr>
+          <w:p>
+            <w:pPr>
+              <w:jc w:val="center"/>
+              <w:rPr>
+                <w:sz w:val="24"/>
+                <w:szCs w:val="24"/>
+              </w:rPr>
+            </w:pPr>
+            <w:r>
+              <w:rPr>
+                <w:b w:val="1"/>
+                <w:bCs w:val="1"/>
+                <w:sz w:val="24"/>
+                <w:szCs w:val="24"/>
+                <w:rtl w:val="1"/>
+              </w:rPr>
+              <w:t xml:space="preserve">ب</w:t>
+            </w:r>
+          </w:p>
+        </w:tc>
+        <w:tc>
+          <w:tcPr>
+            <w:tcBorders>
+              <w:top w:color="808080" w:space="0" w:sz="4" w:val="single"/>
+              <w:left w:color="808080" w:space="0" w:sz="4" w:val="single"/>
+              <w:bottom w:color="808080" w:space="0" w:sz="4" w:val="single"/>
+              <w:right w:color="808080" w:space="0" w:sz="4" w:val="single"/>
+            </w:tcBorders>
             <w:shd w:val="clear" w:color="auto" w:fill="D9EAD3"/>
             <w:tcMar>
               <w:top w:w="60.0" w:type="dxa"/>
@@ -2646,134 +2775,29 @@
               <w:bottom w:color="808080" w:space="0" w:sz="4" w:val="single"/>
               <w:right w:color="808080" w:space="0" w:sz="4" w:val="single"/>
             </w:tcBorders>
-            <w:shd w:val="clear" w:color="auto" w:fill="FFF2CC"/>
-            <w:tcMar>
-              <w:top w:w="60.0" w:type="dxa"/>
-              <w:bottom w:w="60.0" w:type="dxa"/>
-            </w:tcMar>
-            <w:vAlign w:val="center"/>
-          </w:tcPr>
-          <w:p>
-            <w:pPr>
-              <w:jc w:val="center"/>
-              <w:rPr>
-                <w:sz w:val="24"/>
-                <w:szCs w:val="24"/>
-              </w:rPr>
-            </w:pPr>
-            <w:r>
-              <w:rPr>
-                <w:b w:val="1"/>
-                <w:bCs w:val="1"/>
-                <w:sz w:val="24"/>
-                <w:szCs w:val="24"/>
-                <w:rtl w:val="1"/>
-              </w:rPr>
-              <w:t xml:space="preserve">ب</w:t>
-            </w:r>
-          </w:p>
-        </w:tc>
-        <w:tc>
-          <w:tcPr>
-            <w:tcBorders>
-              <w:top w:color="808080" w:space="0" w:sz="4" w:val="single"/>
-              <w:left w:color="808080" w:space="0" w:sz="4" w:val="single"/>
-              <w:bottom w:color="808080" w:space="0" w:sz="4" w:val="single"/>
-              <w:right w:color="808080" w:space="0" w:sz="4" w:val="single"/>
-            </w:tcBorders>
-            <w:shd w:val="clear" w:color="auto" w:fill="D9EAD3"/>
-            <w:tcMar>
-              <w:top w:w="60.0" w:type="dxa"/>
-              <w:bottom w:w="60.0" w:type="dxa"/>
-            </w:tcMar>
-            <w:vAlign w:val="center"/>
-          </w:tcPr>
-          <w:p>
-            <w:pPr>
-              <w:jc w:val="center"/>
-              <w:rPr>
-                <w:sz w:val="24"/>
-                <w:szCs w:val="24"/>
-              </w:rPr>
-            </w:pPr>
-            <w:r>
-              <w:rPr>
-                <w:b w:val="1"/>
-                <w:bCs w:val="1"/>
-                <w:sz w:val="24"/>
-                <w:szCs w:val="24"/>
-                <w:rtl w:val="1"/>
-              </w:rPr>
-              <w:t xml:space="preserve">أ</w:t>
-            </w:r>
-          </w:p>
-        </w:tc>
-        <w:tc>
-          <w:tcPr>
-            <w:tcBorders>
-              <w:top w:color="808080" w:space="0" w:sz="4" w:val="single"/>
-              <w:left w:color="808080" w:space="0" w:sz="4" w:val="single"/>
-              <w:bottom w:color="808080" w:space="0" w:sz="4" w:val="single"/>
-              <w:right w:color="808080" w:space="0" w:sz="4" w:val="single"/>
-            </w:tcBorders>
-            <w:shd w:val="clear" w:color="auto" w:fill="D9EAD3"/>
-            <w:tcMar>
-              <w:top w:w="60.0" w:type="dxa"/>
-              <w:bottom w:w="60.0" w:type="dxa"/>
-            </w:tcMar>
-            <w:vAlign w:val="center"/>
-          </w:tcPr>
-          <w:p>
-            <w:pPr>
-              <w:jc w:val="center"/>
-              <w:rPr>
-                <w:sz w:val="24"/>
-                <w:szCs w:val="24"/>
-              </w:rPr>
-            </w:pPr>
-            <w:r>
-              <w:rPr>
-                <w:b w:val="1"/>
-                <w:bCs w:val="1"/>
-                <w:sz w:val="24"/>
-                <w:szCs w:val="24"/>
-                <w:rtl w:val="1"/>
-              </w:rPr>
-              <w:t xml:space="preserve">أ</w:t>
-            </w:r>
-          </w:p>
-        </w:tc>
-        <w:tc>
-          <w:tcPr>
-            <w:tcBorders>
-              <w:top w:color="808080" w:space="0" w:sz="4" w:val="single"/>
-              <w:left w:color="808080" w:space="0" w:sz="4" w:val="single"/>
-              <w:bottom w:color="808080" w:space="0" w:sz="4" w:val="single"/>
-              <w:right w:color="808080" w:space="0" w:sz="4" w:val="single"/>
-            </w:tcBorders>
-            <w:tcMar>
-              <w:top w:w="60.0" w:type="dxa"/>
-              <w:bottom w:w="60.0" w:type="dxa"/>
-            </w:tcMar>
-            <w:vAlign w:val="center"/>
-          </w:tcPr>
-          <w:p>
-            <w:pPr>
-              <w:jc w:val="center"/>
-              <w:rPr>
-                <w:sz w:val="24"/>
-                <w:szCs w:val="24"/>
-              </w:rPr>
-            </w:pPr>
-            <w:r>
-              <w:rPr>
-                <w:b w:val="1"/>
-                <w:bCs w:val="1"/>
-                <w:sz w:val="24"/>
-                <w:szCs w:val="24"/>
-                <w:rtl w:val="1"/>
-              </w:rPr>
-              <w:t xml:space="preserve">19</w:t>
+            <w:tcMar>
+              <w:top w:w="60.0" w:type="dxa"/>
+              <w:bottom w:w="60.0" w:type="dxa"/>
+            </w:tcMar>
+            <w:vAlign w:val="center"/>
+          </w:tcPr>
+          <w:p>
+            <w:pPr>
+              <w:jc w:val="center"/>
+              <w:rPr>
+                <w:sz w:val="24"/>
+                <w:szCs w:val="24"/>
+              </w:rPr>
+            </w:pPr>
+            <w:r>
+              <w:rPr>
+                <w:b w:val="1"/>
+                <w:bCs w:val="1"/>
+                <w:sz w:val="24"/>
+                <w:szCs w:val="24"/>
+                <w:rtl w:val="1"/>
+              </w:rPr>
+              <w:t xml:space="preserve">16</w:t>
             </w:r>
           </w:p>
         </w:tc>
@@ -2813,7 +2837,7 @@
                 <w:szCs w:val="24"/>
                 <w:rtl w:val="1"/>
               </w:rPr>
-              <w:t xml:space="preserve">ابراهيم صيدح</w:t>
+              <w:t xml:space="preserve">خليل السبليني</w:t>
             </w:r>
           </w:p>
         </w:tc>
@@ -2848,42 +2872,7 @@
                 <w:szCs w:val="24"/>
                 <w:rtl w:val="1"/>
               </w:rPr>
-              <w:t xml:space="preserve">أ-</w:t>
-            </w:r>
-          </w:p>
-        </w:tc>
-        <w:tc>
-          <w:tcPr>
-            <w:tcBorders>
-              <w:top w:color="808080" w:space="0" w:sz="4" w:val="single"/>
-              <w:left w:color="808080" w:space="0" w:sz="4" w:val="single"/>
-              <w:bottom w:color="808080" w:space="0" w:sz="4" w:val="single"/>
-              <w:right w:color="808080" w:space="0" w:sz="4" w:val="single"/>
-            </w:tcBorders>
-            <w:shd w:val="clear" w:color="auto" w:fill="FFF2CC"/>
-            <w:tcMar>
-              <w:top w:w="60.0" w:type="dxa"/>
-              <w:bottom w:w="60.0" w:type="dxa"/>
-            </w:tcMar>
-            <w:vAlign w:val="center"/>
-          </w:tcPr>
-          <w:p>
-            <w:pPr>
-              <w:jc w:val="center"/>
-              <w:rPr>
-                <w:sz w:val="24"/>
-                <w:szCs w:val="24"/>
-              </w:rPr>
-            </w:pPr>
-            <w:r>
-              <w:rPr>
-                <w:b w:val="1"/>
-                <w:bCs w:val="1"/>
-                <w:sz w:val="24"/>
-                <w:szCs w:val="24"/>
-                <w:rtl w:val="1"/>
-              </w:rPr>
-              <w:t xml:space="preserve">ب+</w:t>
+              <w:t xml:space="preserve">أ</w:t>
             </w:r>
           </w:p>
         </w:tc>
@@ -2930,41 +2919,6 @@
               <w:bottom w:color="808080" w:space="0" w:sz="4" w:val="single"/>
               <w:right w:color="808080" w:space="0" w:sz="4" w:val="single"/>
             </w:tcBorders>
-            <w:shd w:val="clear" w:color="auto" w:fill="FFF2CC"/>
-            <w:tcMar>
-              <w:top w:w="60.0" w:type="dxa"/>
-              <w:bottom w:w="60.0" w:type="dxa"/>
-            </w:tcMar>
-            <w:vAlign w:val="center"/>
-          </w:tcPr>
-          <w:p>
-            <w:pPr>
-              <w:jc w:val="center"/>
-              <w:rPr>
-                <w:sz w:val="24"/>
-                <w:szCs w:val="24"/>
-              </w:rPr>
-            </w:pPr>
-            <w:r>
-              <w:rPr>
-                <w:b w:val="1"/>
-                <w:bCs w:val="1"/>
-                <w:sz w:val="24"/>
-                <w:szCs w:val="24"/>
-                <w:rtl w:val="1"/>
-              </w:rPr>
-              <w:t xml:space="preserve">ب</w:t>
-            </w:r>
-          </w:p>
-        </w:tc>
-        <w:tc>
-          <w:tcPr>
-            <w:tcBorders>
-              <w:top w:color="808080" w:space="0" w:sz="4" w:val="single"/>
-              <w:left w:color="808080" w:space="0" w:sz="4" w:val="single"/>
-              <w:bottom w:color="808080" w:space="0" w:sz="4" w:val="single"/>
-              <w:right w:color="808080" w:space="0" w:sz="4" w:val="single"/>
-            </w:tcBorders>
             <w:shd w:val="clear" w:color="auto" w:fill="D9EAD3"/>
             <w:tcMar>
               <w:top w:w="60.0" w:type="dxa"/>
@@ -3000,41 +2954,6 @@
               <w:bottom w:color="808080" w:space="0" w:sz="4" w:val="single"/>
               <w:right w:color="808080" w:space="0" w:sz="4" w:val="single"/>
             </w:tcBorders>
-            <w:shd w:val="clear" w:color="auto" w:fill="FFF2CC"/>
-            <w:tcMar>
-              <w:top w:w="60.0" w:type="dxa"/>
-              <w:bottom w:w="60.0" w:type="dxa"/>
-            </w:tcMar>
-            <w:vAlign w:val="center"/>
-          </w:tcPr>
-          <w:p>
-            <w:pPr>
-              <w:jc w:val="center"/>
-              <w:rPr>
-                <w:sz w:val="24"/>
-                <w:szCs w:val="24"/>
-              </w:rPr>
-            </w:pPr>
-            <w:r>
-              <w:rPr>
-                <w:b w:val="1"/>
-                <w:bCs w:val="1"/>
-                <w:sz w:val="24"/>
-                <w:szCs w:val="24"/>
-                <w:rtl w:val="1"/>
-              </w:rPr>
-              <w:t xml:space="preserve">ب</w:t>
-            </w:r>
-          </w:p>
-        </w:tc>
-        <w:tc>
-          <w:tcPr>
-            <w:tcBorders>
-              <w:top w:color="808080" w:space="0" w:sz="4" w:val="single"/>
-              <w:left w:color="808080" w:space="0" w:sz="4" w:val="single"/>
-              <w:bottom w:color="808080" w:space="0" w:sz="4" w:val="single"/>
-              <w:right w:color="808080" w:space="0" w:sz="4" w:val="single"/>
-            </w:tcBorders>
             <w:shd w:val="clear" w:color="auto" w:fill="D9EAD3"/>
             <w:tcMar>
               <w:top w:w="60.0" w:type="dxa"/>
@@ -3093,41 +3012,146 @@
                 <w:szCs w:val="24"/>
                 <w:rtl w:val="1"/>
               </w:rPr>
-              <w:t xml:space="preserve">أ-</w:t>
-            </w:r>
-          </w:p>
-        </w:tc>
-        <w:tc>
-          <w:tcPr>
-            <w:tcBorders>
-              <w:top w:color="808080" w:space="0" w:sz="4" w:val="single"/>
-              <w:left w:color="808080" w:space="0" w:sz="4" w:val="single"/>
-              <w:bottom w:color="808080" w:space="0" w:sz="4" w:val="single"/>
-              <w:right w:color="808080" w:space="0" w:sz="4" w:val="single"/>
-            </w:tcBorders>
-            <w:tcMar>
-              <w:top w:w="60.0" w:type="dxa"/>
-              <w:bottom w:w="60.0" w:type="dxa"/>
-            </w:tcMar>
-            <w:vAlign w:val="center"/>
-          </w:tcPr>
-          <w:p>
-            <w:pPr>
-              <w:jc w:val="center"/>
-              <w:rPr>
-                <w:sz w:val="24"/>
-                <w:szCs w:val="24"/>
-              </w:rPr>
-            </w:pPr>
-            <w:r>
-              <w:rPr>
-                <w:b w:val="1"/>
-                <w:bCs w:val="1"/>
-                <w:sz w:val="24"/>
-                <w:szCs w:val="24"/>
-                <w:rtl w:val="1"/>
-              </w:rPr>
-              <w:t xml:space="preserve">16</w:t>
+              <w:t xml:space="preserve">أ</w:t>
+            </w:r>
+          </w:p>
+        </w:tc>
+        <w:tc>
+          <w:tcPr>
+            <w:tcBorders>
+              <w:top w:color="808080" w:space="0" w:sz="4" w:val="single"/>
+              <w:left w:color="808080" w:space="0" w:sz="4" w:val="single"/>
+              <w:bottom w:color="808080" w:space="0" w:sz="4" w:val="single"/>
+              <w:right w:color="808080" w:space="0" w:sz="4" w:val="single"/>
+            </w:tcBorders>
+            <w:shd w:val="clear" w:color="auto" w:fill="D9EAD3"/>
+            <w:tcMar>
+              <w:top w:w="60.0" w:type="dxa"/>
+              <w:bottom w:w="60.0" w:type="dxa"/>
+            </w:tcMar>
+            <w:vAlign w:val="center"/>
+          </w:tcPr>
+          <w:p>
+            <w:pPr>
+              <w:jc w:val="center"/>
+              <w:rPr>
+                <w:sz w:val="24"/>
+                <w:szCs w:val="24"/>
+              </w:rPr>
+            </w:pPr>
+            <w:r>
+              <w:rPr>
+                <w:b w:val="1"/>
+                <w:bCs w:val="1"/>
+                <w:sz w:val="24"/>
+                <w:szCs w:val="24"/>
+                <w:rtl w:val="1"/>
+              </w:rPr>
+              <w:t xml:space="preserve">أ</w:t>
+            </w:r>
+          </w:p>
+        </w:tc>
+        <w:tc>
+          <w:tcPr>
+            <w:tcBorders>
+              <w:top w:color="808080" w:space="0" w:sz="4" w:val="single"/>
+              <w:left w:color="808080" w:space="0" w:sz="4" w:val="single"/>
+              <w:bottom w:color="808080" w:space="0" w:sz="4" w:val="single"/>
+              <w:right w:color="808080" w:space="0" w:sz="4" w:val="single"/>
+            </w:tcBorders>
+            <w:shd w:val="clear" w:color="auto" w:fill="D9EAD3"/>
+            <w:tcMar>
+              <w:top w:w="60.0" w:type="dxa"/>
+              <w:bottom w:w="60.0" w:type="dxa"/>
+            </w:tcMar>
+            <w:vAlign w:val="center"/>
+          </w:tcPr>
+          <w:p>
+            <w:pPr>
+              <w:jc w:val="center"/>
+              <w:rPr>
+                <w:sz w:val="24"/>
+                <w:szCs w:val="24"/>
+              </w:rPr>
+            </w:pPr>
+            <w:r>
+              <w:rPr>
+                <w:b w:val="1"/>
+                <w:bCs w:val="1"/>
+                <w:sz w:val="24"/>
+                <w:szCs w:val="24"/>
+                <w:rtl w:val="1"/>
+              </w:rPr>
+              <w:t xml:space="preserve">أ</w:t>
+            </w:r>
+          </w:p>
+        </w:tc>
+        <w:tc>
+          <w:tcPr>
+            <w:tcBorders>
+              <w:top w:color="808080" w:space="0" w:sz="4" w:val="single"/>
+              <w:left w:color="808080" w:space="0" w:sz="4" w:val="single"/>
+              <w:bottom w:color="808080" w:space="0" w:sz="4" w:val="single"/>
+              <w:right w:color="808080" w:space="0" w:sz="4" w:val="single"/>
+            </w:tcBorders>
+            <w:shd w:val="clear" w:color="auto" w:fill="D9EAD3"/>
+            <w:tcMar>
+              <w:top w:w="60.0" w:type="dxa"/>
+              <w:bottom w:w="60.0" w:type="dxa"/>
+            </w:tcMar>
+            <w:vAlign w:val="center"/>
+          </w:tcPr>
+          <w:p>
+            <w:pPr>
+              <w:jc w:val="center"/>
+              <w:rPr>
+                <w:sz w:val="24"/>
+                <w:szCs w:val="24"/>
+              </w:rPr>
+            </w:pPr>
+            <w:r>
+              <w:rPr>
+                <w:b w:val="1"/>
+                <w:bCs w:val="1"/>
+                <w:sz w:val="24"/>
+                <w:szCs w:val="24"/>
+                <w:rtl w:val="1"/>
+              </w:rPr>
+              <w:t xml:space="preserve">أ</w:t>
+            </w:r>
+          </w:p>
+        </w:tc>
+        <w:tc>
+          <w:tcPr>
+            <w:tcBorders>
+              <w:top w:color="808080" w:space="0" w:sz="4" w:val="single"/>
+              <w:left w:color="808080" w:space="0" w:sz="4" w:val="single"/>
+              <w:bottom w:color="808080" w:space="0" w:sz="4" w:val="single"/>
+              <w:right w:color="808080" w:space="0" w:sz="4" w:val="single"/>
+            </w:tcBorders>
+            <w:tcMar>
+              <w:top w:w="60.0" w:type="dxa"/>
+              <w:bottom w:w="60.0" w:type="dxa"/>
+            </w:tcMar>
+            <w:vAlign w:val="center"/>
+          </w:tcPr>
+          <w:p>
+            <w:pPr>
+              <w:jc w:val="center"/>
+              <w:rPr>
+                <w:sz w:val="24"/>
+                <w:szCs w:val="24"/>
+              </w:rPr>
+            </w:pPr>
+            <w:r>
+              <w:rPr>
+                <w:b w:val="1"/>
+                <w:bCs w:val="1"/>
+                <w:sz w:val="24"/>
+                <w:szCs w:val="24"/>
+                <w:rtl w:val="1"/>
+              </w:rPr>
+              <w:t xml:space="preserve">20</w:t>
             </w:r>
           </w:p>
         </w:tc>
@@ -3167,7 +3191,147 @@
                 <w:szCs w:val="24"/>
                 <w:rtl w:val="1"/>
               </w:rPr>
-              <w:t xml:space="preserve">خليل السبليني</w:t>
+              <w:t xml:space="preserve">فضل ملك</w:t>
+            </w:r>
+          </w:p>
+        </w:tc>
+        <w:tc>
+          <w:tcPr>
+            <w:tcBorders>
+              <w:top w:color="808080" w:space="0" w:sz="4" w:val="single"/>
+              <w:left w:color="808080" w:space="0" w:sz="4" w:val="single"/>
+              <w:bottom w:color="808080" w:space="0" w:sz="4" w:val="single"/>
+              <w:right w:color="808080" w:space="0" w:sz="4" w:val="single"/>
+            </w:tcBorders>
+            <w:shd w:val="clear" w:color="auto" w:fill="FFF2CC"/>
+            <w:tcMar>
+              <w:top w:w="60.0" w:type="dxa"/>
+              <w:bottom w:w="60.0" w:type="dxa"/>
+            </w:tcMar>
+            <w:vAlign w:val="center"/>
+          </w:tcPr>
+          <w:p>
+            <w:pPr>
+              <w:jc w:val="center"/>
+              <w:rPr>
+                <w:sz w:val="24"/>
+                <w:szCs w:val="24"/>
+              </w:rPr>
+            </w:pPr>
+            <w:r>
+              <w:rPr>
+                <w:b w:val="1"/>
+                <w:bCs w:val="1"/>
+                <w:sz w:val="24"/>
+                <w:szCs w:val="24"/>
+                <w:rtl w:val="1"/>
+              </w:rPr>
+              <w:t xml:space="preserve">ب</w:t>
+            </w:r>
+          </w:p>
+        </w:tc>
+        <w:tc>
+          <w:tcPr>
+            <w:tcBorders>
+              <w:top w:color="808080" w:space="0" w:sz="4" w:val="single"/>
+              <w:left w:color="808080" w:space="0" w:sz="4" w:val="single"/>
+              <w:bottom w:color="808080" w:space="0" w:sz="4" w:val="single"/>
+              <w:right w:color="808080" w:space="0" w:sz="4" w:val="single"/>
+            </w:tcBorders>
+            <w:shd w:val="clear" w:color="auto" w:fill="FFF2CC"/>
+            <w:tcMar>
+              <w:top w:w="60.0" w:type="dxa"/>
+              <w:bottom w:w="60.0" w:type="dxa"/>
+            </w:tcMar>
+            <w:vAlign w:val="center"/>
+          </w:tcPr>
+          <w:p>
+            <w:pPr>
+              <w:jc w:val="center"/>
+              <w:rPr>
+                <w:sz w:val="24"/>
+                <w:szCs w:val="24"/>
+              </w:rPr>
+            </w:pPr>
+            <w:r>
+              <w:rPr>
+                <w:b w:val="1"/>
+                <w:bCs w:val="1"/>
+                <w:sz w:val="24"/>
+                <w:szCs w:val="24"/>
+                <w:rtl w:val="1"/>
+              </w:rPr>
+              <w:t xml:space="preserve">ب</w:t>
+            </w:r>
+          </w:p>
+        </w:tc>
+        <w:tc>
+          <w:tcPr>
+            <w:tcBorders>
+              <w:top w:color="808080" w:space="0" w:sz="4" w:val="single"/>
+              <w:left w:color="808080" w:space="0" w:sz="4" w:val="single"/>
+              <w:bottom w:color="808080" w:space="0" w:sz="4" w:val="single"/>
+              <w:right w:color="808080" w:space="0" w:sz="4" w:val="single"/>
+            </w:tcBorders>
+            <w:shd w:val="clear" w:color="auto" w:fill="FFF2CC"/>
+            <w:tcMar>
+              <w:top w:w="60.0" w:type="dxa"/>
+              <w:bottom w:w="60.0" w:type="dxa"/>
+            </w:tcMar>
+            <w:vAlign w:val="center"/>
+          </w:tcPr>
+          <w:p>
+            <w:pPr>
+              <w:jc w:val="center"/>
+              <w:rPr>
+                <w:sz w:val="24"/>
+                <w:szCs w:val="24"/>
+              </w:rPr>
+            </w:pPr>
+            <w:r>
+              <w:rPr>
+                <w:b w:val="1"/>
+                <w:bCs w:val="1"/>
+                <w:sz w:val="24"/>
+                <w:szCs w:val="24"/>
+                <w:rtl w:val="1"/>
+              </w:rPr>
+              <w:t xml:space="preserve">ب</w:t>
+            </w:r>
+          </w:p>
+        </w:tc>
+        <w:tc>
+          <w:tcPr>
+            <w:tcBorders>
+              <w:top w:color="808080" w:space="0" w:sz="4" w:val="single"/>
+              <w:left w:color="808080" w:space="0" w:sz="4" w:val="single"/>
+              <w:bottom w:color="808080" w:space="0" w:sz="4" w:val="single"/>
+              <w:right w:color="808080" w:space="0" w:sz="4" w:val="single"/>
+            </w:tcBorders>
+            <w:shd w:val="clear" w:color="auto" w:fill="FFF2CC"/>
+            <w:tcMar>
+              <w:top w:w="60.0" w:type="dxa"/>
+              <w:bottom w:w="60.0" w:type="dxa"/>
+            </w:tcMar>
+            <w:vAlign w:val="center"/>
+          </w:tcPr>
+          <w:p>
+            <w:pPr>
+              <w:jc w:val="center"/>
+              <w:rPr>
+                <w:sz w:val="24"/>
+                <w:szCs w:val="24"/>
+              </w:rPr>
+            </w:pPr>
+            <w:r>
+              <w:rPr>
+                <w:b w:val="1"/>
+                <w:bCs w:val="1"/>
+                <w:sz w:val="24"/>
+                <w:szCs w:val="24"/>
+                <w:rtl w:val="1"/>
+              </w:rPr>
+              <w:t xml:space="preserve">ب</w:t>
             </w:r>
           </w:p>
         </w:tc>
@@ -3214,6 +3378,41 @@
               <w:bottom w:color="808080" w:space="0" w:sz="4" w:val="single"/>
               <w:right w:color="808080" w:space="0" w:sz="4" w:val="single"/>
             </w:tcBorders>
+            <w:shd w:val="clear" w:color="auto" w:fill="FFF2CC"/>
+            <w:tcMar>
+              <w:top w:w="60.0" w:type="dxa"/>
+              <w:bottom w:w="60.0" w:type="dxa"/>
+            </w:tcMar>
+            <w:vAlign w:val="center"/>
+          </w:tcPr>
+          <w:p>
+            <w:pPr>
+              <w:jc w:val="center"/>
+              <w:rPr>
+                <w:sz w:val="24"/>
+                <w:szCs w:val="24"/>
+              </w:rPr>
+            </w:pPr>
+            <w:r>
+              <w:rPr>
+                <w:b w:val="1"/>
+                <w:bCs w:val="1"/>
+                <w:sz w:val="24"/>
+                <w:szCs w:val="24"/>
+                <w:rtl w:val="1"/>
+              </w:rPr>
+              <w:t xml:space="preserve">ب</w:t>
+            </w:r>
+          </w:p>
+        </w:tc>
+        <w:tc>
+          <w:tcPr>
+            <w:tcBorders>
+              <w:top w:color="808080" w:space="0" w:sz="4" w:val="single"/>
+              <w:left w:color="808080" w:space="0" w:sz="4" w:val="single"/>
+              <w:bottom w:color="808080" w:space="0" w:sz="4" w:val="single"/>
+              <w:right w:color="808080" w:space="0" w:sz="4" w:val="single"/>
+            </w:tcBorders>
             <w:shd w:val="clear" w:color="auto" w:fill="D9EAD3"/>
             <w:tcMar>
               <w:top w:w="60.0" w:type="dxa"/>
@@ -3284,204 +3483,29 @@
               <w:bottom w:color="808080" w:space="0" w:sz="4" w:val="single"/>
               <w:right w:color="808080" w:space="0" w:sz="4" w:val="single"/>
             </w:tcBorders>
-            <w:shd w:val="clear" w:color="auto" w:fill="D9EAD3"/>
-            <w:tcMar>
-              <w:top w:w="60.0" w:type="dxa"/>
-              <w:bottom w:w="60.0" w:type="dxa"/>
-            </w:tcMar>
-            <w:vAlign w:val="center"/>
-          </w:tcPr>
-          <w:p>
-            <w:pPr>
-              <w:jc w:val="center"/>
-              <w:rPr>
-                <w:sz w:val="24"/>
-                <w:szCs w:val="24"/>
-              </w:rPr>
-            </w:pPr>
-            <w:r>
-              <w:rPr>
-                <w:b w:val="1"/>
-                <w:bCs w:val="1"/>
-                <w:sz w:val="24"/>
-                <w:szCs w:val="24"/>
-                <w:rtl w:val="1"/>
-              </w:rPr>
-              <w:t xml:space="preserve">أ</w:t>
-            </w:r>
-          </w:p>
-        </w:tc>
-        <w:tc>
-          <w:tcPr>
-            <w:tcBorders>
-              <w:top w:color="808080" w:space="0" w:sz="4" w:val="single"/>
-              <w:left w:color="808080" w:space="0" w:sz="4" w:val="single"/>
-              <w:bottom w:color="808080" w:space="0" w:sz="4" w:val="single"/>
-              <w:right w:color="808080" w:space="0" w:sz="4" w:val="single"/>
-            </w:tcBorders>
-            <w:shd w:val="clear" w:color="auto" w:fill="D9EAD3"/>
-            <w:tcMar>
-              <w:top w:w="60.0" w:type="dxa"/>
-              <w:bottom w:w="60.0" w:type="dxa"/>
-            </w:tcMar>
-            <w:vAlign w:val="center"/>
-          </w:tcPr>
-          <w:p>
-            <w:pPr>
-              <w:jc w:val="center"/>
-              <w:rPr>
-                <w:sz w:val="24"/>
-                <w:szCs w:val="24"/>
-              </w:rPr>
-            </w:pPr>
-            <w:r>
-              <w:rPr>
-                <w:b w:val="1"/>
-                <w:bCs w:val="1"/>
-                <w:sz w:val="24"/>
-                <w:szCs w:val="24"/>
-                <w:rtl w:val="1"/>
-              </w:rPr>
-              <w:t xml:space="preserve">أ</w:t>
-            </w:r>
-          </w:p>
-        </w:tc>
-        <w:tc>
-          <w:tcPr>
-            <w:tcBorders>
-              <w:top w:color="808080" w:space="0" w:sz="4" w:val="single"/>
-              <w:left w:color="808080" w:space="0" w:sz="4" w:val="single"/>
-              <w:bottom w:color="808080" w:space="0" w:sz="4" w:val="single"/>
-              <w:right w:color="808080" w:space="0" w:sz="4" w:val="single"/>
-            </w:tcBorders>
-            <w:shd w:val="clear" w:color="auto" w:fill="D9EAD3"/>
-            <w:tcMar>
-              <w:top w:w="60.0" w:type="dxa"/>
-              <w:bottom w:w="60.0" w:type="dxa"/>
-            </w:tcMar>
-            <w:vAlign w:val="center"/>
-          </w:tcPr>
-          <w:p>
-            <w:pPr>
-              <w:jc w:val="center"/>
-              <w:rPr>
-                <w:sz w:val="24"/>
-                <w:szCs w:val="24"/>
-              </w:rPr>
-            </w:pPr>
-            <w:r>
-              <w:rPr>
-                <w:b w:val="1"/>
-                <w:bCs w:val="1"/>
-                <w:sz w:val="24"/>
-                <w:szCs w:val="24"/>
-                <w:rtl w:val="1"/>
-              </w:rPr>
-              <w:t xml:space="preserve">أ</w:t>
-            </w:r>
-          </w:p>
-        </w:tc>
-        <w:tc>
-          <w:tcPr>
-            <w:tcBorders>
-              <w:top w:color="808080" w:space="0" w:sz="4" w:val="single"/>
-              <w:left w:color="808080" w:space="0" w:sz="4" w:val="single"/>
-              <w:bottom w:color="808080" w:space="0" w:sz="4" w:val="single"/>
-              <w:right w:color="808080" w:space="0" w:sz="4" w:val="single"/>
-            </w:tcBorders>
-            <w:shd w:val="clear" w:color="auto" w:fill="D9EAD3"/>
-            <w:tcMar>
-              <w:top w:w="60.0" w:type="dxa"/>
-              <w:bottom w:w="60.0" w:type="dxa"/>
-            </w:tcMar>
-            <w:vAlign w:val="center"/>
-          </w:tcPr>
-          <w:p>
-            <w:pPr>
-              <w:jc w:val="center"/>
-              <w:rPr>
-                <w:sz w:val="24"/>
-                <w:szCs w:val="24"/>
-              </w:rPr>
-            </w:pPr>
-            <w:r>
-              <w:rPr>
-                <w:b w:val="1"/>
-                <w:bCs w:val="1"/>
-                <w:sz w:val="24"/>
-                <w:szCs w:val="24"/>
-                <w:rtl w:val="1"/>
-              </w:rPr>
-              <w:t xml:space="preserve">أ</w:t>
-            </w:r>
-          </w:p>
-        </w:tc>
-        <w:tc>
-          <w:tcPr>
-            <w:tcBorders>
-              <w:top w:color="808080" w:space="0" w:sz="4" w:val="single"/>
-              <w:left w:color="808080" w:space="0" w:sz="4" w:val="single"/>
-              <w:bottom w:color="808080" w:space="0" w:sz="4" w:val="single"/>
-              <w:right w:color="808080" w:space="0" w:sz="4" w:val="single"/>
-            </w:tcBorders>
-            <w:shd w:val="clear" w:color="auto" w:fill="D9EAD3"/>
-            <w:tcMar>
-              <w:top w:w="60.0" w:type="dxa"/>
-              <w:bottom w:w="60.0" w:type="dxa"/>
-            </w:tcMar>
-            <w:vAlign w:val="center"/>
-          </w:tcPr>
-          <w:p>
-            <w:pPr>
-              <w:jc w:val="center"/>
-              <w:rPr>
-                <w:sz w:val="24"/>
-                <w:szCs w:val="24"/>
-              </w:rPr>
-            </w:pPr>
-            <w:r>
-              <w:rPr>
-                <w:b w:val="1"/>
-                <w:bCs w:val="1"/>
-                <w:sz w:val="24"/>
-                <w:szCs w:val="24"/>
-                <w:rtl w:val="1"/>
-              </w:rPr>
-              <w:t xml:space="preserve">أ</w:t>
-            </w:r>
-          </w:p>
-        </w:tc>
-        <w:tc>
-          <w:tcPr>
-            <w:tcBorders>
-              <w:top w:color="808080" w:space="0" w:sz="4" w:val="single"/>
-              <w:left w:color="808080" w:space="0" w:sz="4" w:val="single"/>
-              <w:bottom w:color="808080" w:space="0" w:sz="4" w:val="single"/>
-              <w:right w:color="808080" w:space="0" w:sz="4" w:val="single"/>
-            </w:tcBorders>
-            <w:tcMar>
-              <w:top w:w="60.0" w:type="dxa"/>
-              <w:bottom w:w="60.0" w:type="dxa"/>
-            </w:tcMar>
-            <w:vAlign w:val="center"/>
-          </w:tcPr>
-          <w:p>
-            <w:pPr>
-              <w:jc w:val="center"/>
-              <w:rPr>
-                <w:sz w:val="24"/>
-                <w:szCs w:val="24"/>
-              </w:rPr>
-            </w:pPr>
-            <w:r>
-              <w:rPr>
-                <w:b w:val="1"/>
-                <w:bCs w:val="1"/>
-                <w:sz w:val="24"/>
-                <w:szCs w:val="24"/>
-                <w:rtl w:val="1"/>
-              </w:rPr>
-              <w:t xml:space="preserve">20</w:t>
+            <w:tcMar>
+              <w:top w:w="60.0" w:type="dxa"/>
+              <w:bottom w:w="60.0" w:type="dxa"/>
+            </w:tcMar>
+            <w:vAlign w:val="center"/>
+          </w:tcPr>
+          <w:p>
+            <w:pPr>
+              <w:jc w:val="center"/>
+              <w:rPr>
+                <w:sz w:val="24"/>
+                <w:szCs w:val="24"/>
+              </w:rPr>
+            </w:pPr>
+            <w:r>
+              <w:rPr>
+                <w:b w:val="1"/>
+                <w:bCs w:val="1"/>
+                <w:sz w:val="24"/>
+                <w:szCs w:val="24"/>
+                <w:rtl w:val="1"/>
+              </w:rPr>
+              <w:t xml:space="preserve">14</w:t>
             </w:r>
           </w:p>
         </w:tc>
@@ -3521,7 +3545,42 @@
                 <w:szCs w:val="24"/>
                 <w:rtl w:val="1"/>
               </w:rPr>
-              <w:t xml:space="preserve">فضل ملك</w:t>
+              <w:t xml:space="preserve">مريم فخر الدين</w:t>
+            </w:r>
+          </w:p>
+        </w:tc>
+        <w:tc>
+          <w:tcPr>
+            <w:tcBorders>
+              <w:top w:color="808080" w:space="0" w:sz="4" w:val="single"/>
+              <w:left w:color="808080" w:space="0" w:sz="4" w:val="single"/>
+              <w:bottom w:color="808080" w:space="0" w:sz="4" w:val="single"/>
+              <w:right w:color="808080" w:space="0" w:sz="4" w:val="single"/>
+            </w:tcBorders>
+            <w:shd w:val="clear" w:color="auto" w:fill="D9EAD3"/>
+            <w:tcMar>
+              <w:top w:w="60.0" w:type="dxa"/>
+              <w:bottom w:w="60.0" w:type="dxa"/>
+            </w:tcMar>
+            <w:vAlign w:val="center"/>
+          </w:tcPr>
+          <w:p>
+            <w:pPr>
+              <w:jc w:val="center"/>
+              <w:rPr>
+                <w:sz w:val="24"/>
+                <w:szCs w:val="24"/>
+              </w:rPr>
+            </w:pPr>
+            <w:r>
+              <w:rPr>
+                <w:b w:val="1"/>
+                <w:bCs w:val="1"/>
+                <w:sz w:val="24"/>
+                <w:szCs w:val="24"/>
+                <w:rtl w:val="1"/>
+              </w:rPr>
+              <w:t xml:space="preserve">أ</w:t>
             </w:r>
           </w:p>
         </w:tc>
@@ -3556,7 +3615,7 @@
                 <w:szCs w:val="24"/>
                 <w:rtl w:val="1"/>
               </w:rPr>
-              <w:t xml:space="preserve">ب+</w:t>
+              <w:t xml:space="preserve">ب</w:t>
             </w:r>
           </w:p>
         </w:tc>
@@ -3626,7 +3685,42 @@
                 <w:szCs w:val="24"/>
                 <w:rtl w:val="1"/>
               </w:rPr>
-              <w:t xml:space="preserve">ب+</w:t>
+              <w:t xml:space="preserve">ب</w:t>
+            </w:r>
+          </w:p>
+        </w:tc>
+        <w:tc>
+          <w:tcPr>
+            <w:tcBorders>
+              <w:top w:color="808080" w:space="0" w:sz="4" w:val="single"/>
+              <w:left w:color="808080" w:space="0" w:sz="4" w:val="single"/>
+              <w:bottom w:color="808080" w:space="0" w:sz="4" w:val="single"/>
+              <w:right w:color="808080" w:space="0" w:sz="4" w:val="single"/>
+            </w:tcBorders>
+            <w:shd w:val="clear" w:color="auto" w:fill="D9EAD3"/>
+            <w:tcMar>
+              <w:top w:w="60.0" w:type="dxa"/>
+              <w:bottom w:w="60.0" w:type="dxa"/>
+            </w:tcMar>
+            <w:vAlign w:val="center"/>
+          </w:tcPr>
+          <w:p>
+            <w:pPr>
+              <w:jc w:val="center"/>
+              <w:rPr>
+                <w:sz w:val="24"/>
+                <w:szCs w:val="24"/>
+              </w:rPr>
+            </w:pPr>
+            <w:r>
+              <w:rPr>
+                <w:b w:val="1"/>
+                <w:bCs w:val="1"/>
+                <w:sz w:val="24"/>
+                <w:szCs w:val="24"/>
+                <w:rtl w:val="1"/>
+              </w:rPr>
+              <w:t xml:space="preserve">أ</w:t>
             </w:r>
           </w:p>
         </w:tc>
@@ -3708,41 +3802,6 @@
               <w:bottom w:color="808080" w:space="0" w:sz="4" w:val="single"/>
               <w:right w:color="808080" w:space="0" w:sz="4" w:val="single"/>
             </w:tcBorders>
-            <w:shd w:val="clear" w:color="auto" w:fill="FCE5CD"/>
-            <w:tcMar>
-              <w:top w:w="60.0" w:type="dxa"/>
-              <w:bottom w:w="60.0" w:type="dxa"/>
-            </w:tcMar>
-            <w:vAlign w:val="center"/>
-          </w:tcPr>
-          <w:p>
-            <w:pPr>
-              <w:jc w:val="center"/>
-              <w:rPr>
-                <w:sz w:val="24"/>
-                <w:szCs w:val="24"/>
-              </w:rPr>
-            </w:pPr>
-            <w:r>
-              <w:rPr>
-                <w:b w:val="1"/>
-                <w:bCs w:val="1"/>
-                <w:sz w:val="24"/>
-                <w:szCs w:val="24"/>
-                <w:rtl w:val="1"/>
-              </w:rPr>
-              <w:t xml:space="preserve">ب-</w:t>
-            </w:r>
-          </w:p>
-        </w:tc>
-        <w:tc>
-          <w:tcPr>
-            <w:tcBorders>
-              <w:top w:color="808080" w:space="0" w:sz="4" w:val="single"/>
-              <w:left w:color="808080" w:space="0" w:sz="4" w:val="single"/>
-              <w:bottom w:color="808080" w:space="0" w:sz="4" w:val="single"/>
-              <w:right w:color="808080" w:space="0" w:sz="4" w:val="single"/>
-            </w:tcBorders>
             <w:shd w:val="clear" w:color="auto" w:fill="D9EAD3"/>
             <w:tcMar>
               <w:top w:w="60.0" w:type="dxa"/>
@@ -3778,64 +3837,29 @@
               <w:bottom w:color="808080" w:space="0" w:sz="4" w:val="single"/>
               <w:right w:color="808080" w:space="0" w:sz="4" w:val="single"/>
             </w:tcBorders>
-            <w:shd w:val="clear" w:color="auto" w:fill="D9EAD3"/>
-            <w:tcMar>
-              <w:top w:w="60.0" w:type="dxa"/>
-              <w:bottom w:w="60.0" w:type="dxa"/>
-            </w:tcMar>
-            <w:vAlign w:val="center"/>
-          </w:tcPr>
-          <w:p>
-            <w:pPr>
-              <w:jc w:val="center"/>
-              <w:rPr>
-                <w:sz w:val="24"/>
-                <w:szCs w:val="24"/>
-              </w:rPr>
-            </w:pPr>
-            <w:r>
-              <w:rPr>
-                <w:b w:val="1"/>
-                <w:bCs w:val="1"/>
-                <w:sz w:val="24"/>
-                <w:szCs w:val="24"/>
-                <w:rtl w:val="1"/>
-              </w:rPr>
-              <w:t xml:space="preserve">أ-</w:t>
-            </w:r>
-          </w:p>
-        </w:tc>
-        <w:tc>
-          <w:tcPr>
-            <w:tcBorders>
-              <w:top w:color="808080" w:space="0" w:sz="4" w:val="single"/>
-              <w:left w:color="808080" w:space="0" w:sz="4" w:val="single"/>
-              <w:bottom w:color="808080" w:space="0" w:sz="4" w:val="single"/>
-              <w:right w:color="808080" w:space="0" w:sz="4" w:val="single"/>
-            </w:tcBorders>
-            <w:tcMar>
-              <w:top w:w="60.0" w:type="dxa"/>
-              <w:bottom w:w="60.0" w:type="dxa"/>
-            </w:tcMar>
-            <w:vAlign w:val="center"/>
-          </w:tcPr>
-          <w:p>
-            <w:pPr>
-              <w:jc w:val="center"/>
-              <w:rPr>
-                <w:sz w:val="24"/>
-                <w:szCs w:val="24"/>
-              </w:rPr>
-            </w:pPr>
-            <w:r>
-              <w:rPr>
-                <w:b w:val="1"/>
-                <w:bCs w:val="1"/>
-                <w:sz w:val="24"/>
-                <w:szCs w:val="24"/>
-                <w:rtl w:val="1"/>
-              </w:rPr>
-              <w:t xml:space="preserve">14</w:t>
+            <w:tcMar>
+              <w:top w:w="60.0" w:type="dxa"/>
+              <w:bottom w:w="60.0" w:type="dxa"/>
+            </w:tcMar>
+            <w:vAlign w:val="center"/>
+          </w:tcPr>
+          <w:p>
+            <w:pPr>
+              <w:jc w:val="center"/>
+              <w:rPr>
+                <w:sz w:val="24"/>
+                <w:szCs w:val="24"/>
+              </w:rPr>
+            </w:pPr>
+            <w:r>
+              <w:rPr>
+                <w:b w:val="1"/>
+                <w:bCs w:val="1"/>
+                <w:sz w:val="24"/>
+                <w:szCs w:val="24"/>
+                <w:rtl w:val="1"/>
+              </w:rPr>
+              <w:t xml:space="preserve">15.5</w:t>
             </w:r>
           </w:p>
         </w:tc>
@@ -3875,7 +3899,7 @@
                 <w:szCs w:val="24"/>
                 <w:rtl w:val="1"/>
               </w:rPr>
-              <w:t xml:space="preserve">مريم فخر الدين</w:t>
+              <w:t xml:space="preserve">فاطمة فردون</w:t>
             </w:r>
           </w:p>
         </w:tc>
@@ -3910,7 +3934,7 @@
                 <w:szCs w:val="24"/>
                 <w:rtl w:val="1"/>
               </w:rPr>
-              <w:t xml:space="preserve">أ-</w:t>
+              <w:t xml:space="preserve">أ</w:t>
             </w:r>
           </w:p>
         </w:tc>
@@ -3980,7 +4004,7 @@
                 <w:szCs w:val="24"/>
                 <w:rtl w:val="1"/>
               </w:rPr>
-              <w:t xml:space="preserve">ب+</w:t>
+              <w:t xml:space="preserve">ب</w:t>
             </w:r>
           </w:p>
         </w:tc>
@@ -4027,6 +4051,111 @@
               <w:bottom w:color="808080" w:space="0" w:sz="4" w:val="single"/>
               <w:right w:color="808080" w:space="0" w:sz="4" w:val="single"/>
             </w:tcBorders>
+            <w:shd w:val="clear" w:color="auto" w:fill="FFF2CC"/>
+            <w:tcMar>
+              <w:top w:w="60.0" w:type="dxa"/>
+              <w:bottom w:w="60.0" w:type="dxa"/>
+            </w:tcMar>
+            <w:vAlign w:val="center"/>
+          </w:tcPr>
+          <w:p>
+            <w:pPr>
+              <w:jc w:val="center"/>
+              <w:rPr>
+                <w:sz w:val="24"/>
+                <w:szCs w:val="24"/>
+              </w:rPr>
+            </w:pPr>
+            <w:r>
+              <w:rPr>
+                <w:b w:val="1"/>
+                <w:bCs w:val="1"/>
+                <w:sz w:val="24"/>
+                <w:szCs w:val="24"/>
+                <w:rtl w:val="1"/>
+              </w:rPr>
+              <w:t xml:space="preserve">ب</w:t>
+            </w:r>
+          </w:p>
+        </w:tc>
+        <w:tc>
+          <w:tcPr>
+            <w:tcBorders>
+              <w:top w:color="808080" w:space="0" w:sz="4" w:val="single"/>
+              <w:left w:color="808080" w:space="0" w:sz="4" w:val="single"/>
+              <w:bottom w:color="808080" w:space="0" w:sz="4" w:val="single"/>
+              <w:right w:color="808080" w:space="0" w:sz="4" w:val="single"/>
+            </w:tcBorders>
+            <w:shd w:val="clear" w:color="auto" w:fill="FFF2CC"/>
+            <w:tcMar>
+              <w:top w:w="60.0" w:type="dxa"/>
+              <w:bottom w:w="60.0" w:type="dxa"/>
+            </w:tcMar>
+            <w:vAlign w:val="center"/>
+          </w:tcPr>
+          <w:p>
+            <w:pPr>
+              <w:jc w:val="center"/>
+              <w:rPr>
+                <w:sz w:val="24"/>
+                <w:szCs w:val="24"/>
+              </w:rPr>
+            </w:pPr>
+            <w:r>
+              <w:rPr>
+                <w:b w:val="1"/>
+                <w:bCs w:val="1"/>
+                <w:sz w:val="24"/>
+                <w:szCs w:val="24"/>
+                <w:rtl w:val="1"/>
+              </w:rPr>
+              <w:t xml:space="preserve">ب</w:t>
+            </w:r>
+          </w:p>
+        </w:tc>
+        <w:tc>
+          <w:tcPr>
+            <w:tcBorders>
+              <w:top w:color="808080" w:space="0" w:sz="4" w:val="single"/>
+              <w:left w:color="808080" w:space="0" w:sz="4" w:val="single"/>
+              <w:bottom w:color="808080" w:space="0" w:sz="4" w:val="single"/>
+              <w:right w:color="808080" w:space="0" w:sz="4" w:val="single"/>
+            </w:tcBorders>
+            <w:shd w:val="clear" w:color="auto" w:fill="FFF2CC"/>
+            <w:tcMar>
+              <w:top w:w="60.0" w:type="dxa"/>
+              <w:bottom w:w="60.0" w:type="dxa"/>
+            </w:tcMar>
+            <w:vAlign w:val="center"/>
+          </w:tcPr>
+          <w:p>
+            <w:pPr>
+              <w:jc w:val="center"/>
+              <w:rPr>
+                <w:sz w:val="24"/>
+                <w:szCs w:val="24"/>
+              </w:rPr>
+            </w:pPr>
+            <w:r>
+              <w:rPr>
+                <w:b w:val="1"/>
+                <w:bCs w:val="1"/>
+                <w:sz w:val="24"/>
+                <w:szCs w:val="24"/>
+                <w:rtl w:val="1"/>
+              </w:rPr>
+              <w:t xml:space="preserve">ب</w:t>
+            </w:r>
+          </w:p>
+        </w:tc>
+        <w:tc>
+          <w:tcPr>
+            <w:tcBorders>
+              <w:top w:color="808080" w:space="0" w:sz="4" w:val="single"/>
+              <w:left w:color="808080" w:space="0" w:sz="4" w:val="single"/>
+              <w:bottom w:color="808080" w:space="0" w:sz="4" w:val="single"/>
+              <w:right w:color="808080" w:space="0" w:sz="4" w:val="single"/>
+            </w:tcBorders>
             <w:shd w:val="clear" w:color="auto" w:fill="D9EAD3"/>
             <w:tcMar>
               <w:top w:w="60.0" w:type="dxa"/>
@@ -4062,134 +4191,29 @@
               <w:bottom w:color="808080" w:space="0" w:sz="4" w:val="single"/>
               <w:right w:color="808080" w:space="0" w:sz="4" w:val="single"/>
             </w:tcBorders>
-            <w:shd w:val="clear" w:color="auto" w:fill="FFF2CC"/>
-            <w:tcMar>
-              <w:top w:w="60.0" w:type="dxa"/>
-              <w:bottom w:w="60.0" w:type="dxa"/>
-            </w:tcMar>
-            <w:vAlign w:val="center"/>
-          </w:tcPr>
-          <w:p>
-            <w:pPr>
-              <w:jc w:val="center"/>
-              <w:rPr>
-                <w:sz w:val="24"/>
-                <w:szCs w:val="24"/>
-              </w:rPr>
-            </w:pPr>
-            <w:r>
-              <w:rPr>
-                <w:b w:val="1"/>
-                <w:bCs w:val="1"/>
-                <w:sz w:val="24"/>
-                <w:szCs w:val="24"/>
-                <w:rtl w:val="1"/>
-              </w:rPr>
-              <w:t xml:space="preserve">ب</w:t>
-            </w:r>
-          </w:p>
-        </w:tc>
-        <w:tc>
-          <w:tcPr>
-            <w:tcBorders>
-              <w:top w:color="808080" w:space="0" w:sz="4" w:val="single"/>
-              <w:left w:color="808080" w:space="0" w:sz="4" w:val="single"/>
-              <w:bottom w:color="808080" w:space="0" w:sz="4" w:val="single"/>
-              <w:right w:color="808080" w:space="0" w:sz="4" w:val="single"/>
-            </w:tcBorders>
-            <w:shd w:val="clear" w:color="auto" w:fill="D9EAD3"/>
-            <w:tcMar>
-              <w:top w:w="60.0" w:type="dxa"/>
-              <w:bottom w:w="60.0" w:type="dxa"/>
-            </w:tcMar>
-            <w:vAlign w:val="center"/>
-          </w:tcPr>
-          <w:p>
-            <w:pPr>
-              <w:jc w:val="center"/>
-              <w:rPr>
-                <w:sz w:val="24"/>
-                <w:szCs w:val="24"/>
-              </w:rPr>
-            </w:pPr>
-            <w:r>
-              <w:rPr>
-                <w:b w:val="1"/>
-                <w:bCs w:val="1"/>
-                <w:sz w:val="24"/>
-                <w:szCs w:val="24"/>
-                <w:rtl w:val="1"/>
-              </w:rPr>
-              <w:t xml:space="preserve">أ</w:t>
-            </w:r>
-          </w:p>
-        </w:tc>
-        <w:tc>
-          <w:tcPr>
-            <w:tcBorders>
-              <w:top w:color="808080" w:space="0" w:sz="4" w:val="single"/>
-              <w:left w:color="808080" w:space="0" w:sz="4" w:val="single"/>
-              <w:bottom w:color="808080" w:space="0" w:sz="4" w:val="single"/>
-              <w:right w:color="808080" w:space="0" w:sz="4" w:val="single"/>
-            </w:tcBorders>
-            <w:shd w:val="clear" w:color="auto" w:fill="D9EAD3"/>
-            <w:tcMar>
-              <w:top w:w="60.0" w:type="dxa"/>
-              <w:bottom w:w="60.0" w:type="dxa"/>
-            </w:tcMar>
-            <w:vAlign w:val="center"/>
-          </w:tcPr>
-          <w:p>
-            <w:pPr>
-              <w:jc w:val="center"/>
-              <w:rPr>
-                <w:sz w:val="24"/>
-                <w:szCs w:val="24"/>
-              </w:rPr>
-            </w:pPr>
-            <w:r>
-              <w:rPr>
-                <w:b w:val="1"/>
-                <w:bCs w:val="1"/>
-                <w:sz w:val="24"/>
-                <w:szCs w:val="24"/>
-                <w:rtl w:val="1"/>
-              </w:rPr>
-              <w:t xml:space="preserve">أ</w:t>
-            </w:r>
-          </w:p>
-        </w:tc>
-        <w:tc>
-          <w:tcPr>
-            <w:tcBorders>
-              <w:top w:color="808080" w:space="0" w:sz="4" w:val="single"/>
-              <w:left w:color="808080" w:space="0" w:sz="4" w:val="single"/>
-              <w:bottom w:color="808080" w:space="0" w:sz="4" w:val="single"/>
-              <w:right w:color="808080" w:space="0" w:sz="4" w:val="single"/>
-            </w:tcBorders>
-            <w:tcMar>
-              <w:top w:w="60.0" w:type="dxa"/>
-              <w:bottom w:w="60.0" w:type="dxa"/>
-            </w:tcMar>
-            <w:vAlign w:val="center"/>
-          </w:tcPr>
-          <w:p>
-            <w:pPr>
-              <w:jc w:val="center"/>
-              <w:rPr>
-                <w:sz w:val="24"/>
-                <w:szCs w:val="24"/>
-              </w:rPr>
-            </w:pPr>
-            <w:r>
-              <w:rPr>
-                <w:b w:val="1"/>
-                <w:bCs w:val="1"/>
-                <w:sz w:val="24"/>
-                <w:szCs w:val="24"/>
-                <w:rtl w:val="1"/>
-              </w:rPr>
-              <w:t xml:space="preserve">15.5</w:t>
+            <w:tcMar>
+              <w:top w:w="60.0" w:type="dxa"/>
+              <w:bottom w:w="60.0" w:type="dxa"/>
+            </w:tcMar>
+            <w:vAlign w:val="center"/>
+          </w:tcPr>
+          <w:p>
+            <w:pPr>
+              <w:jc w:val="center"/>
+              <w:rPr>
+                <w:sz w:val="24"/>
+                <w:szCs w:val="24"/>
+              </w:rPr>
+            </w:pPr>
+            <w:r>
+              <w:rPr>
+                <w:b w:val="1"/>
+                <w:bCs w:val="1"/>
+                <w:sz w:val="24"/>
+                <w:szCs w:val="24"/>
+                <w:rtl w:val="1"/>
+              </w:rPr>
+              <w:t xml:space="preserve">13</w:t>
             </w:r>
           </w:p>
         </w:tc>
@@ -4229,7 +4253,7 @@
                 <w:szCs w:val="24"/>
                 <w:rtl w:val="1"/>
               </w:rPr>
-              <w:t xml:space="preserve">فاطمة فردون</w:t>
+              <w:t xml:space="preserve">علي صالح</w:t>
             </w:r>
           </w:p>
         </w:tc>
@@ -4264,7 +4288,7 @@
                 <w:szCs w:val="24"/>
                 <w:rtl w:val="1"/>
               </w:rPr>
-              <w:t xml:space="preserve">أ-</w:t>
+              <w:t xml:space="preserve">أ</w:t>
             </w:r>
           </w:p>
         </w:tc>
@@ -4311,6 +4335,111 @@
               <w:bottom w:color="808080" w:space="0" w:sz="4" w:val="single"/>
               <w:right w:color="808080" w:space="0" w:sz="4" w:val="single"/>
             </w:tcBorders>
+            <w:shd w:val="clear" w:color="auto" w:fill="D9EAD3"/>
+            <w:tcMar>
+              <w:top w:w="60.0" w:type="dxa"/>
+              <w:bottom w:w="60.0" w:type="dxa"/>
+            </w:tcMar>
+            <w:vAlign w:val="center"/>
+          </w:tcPr>
+          <w:p>
+            <w:pPr>
+              <w:jc w:val="center"/>
+              <w:rPr>
+                <w:sz w:val="24"/>
+                <w:szCs w:val="24"/>
+              </w:rPr>
+            </w:pPr>
+            <w:r>
+              <w:rPr>
+                <w:b w:val="1"/>
+                <w:bCs w:val="1"/>
+                <w:sz w:val="24"/>
+                <w:szCs w:val="24"/>
+                <w:rtl w:val="1"/>
+              </w:rPr>
+              <w:t xml:space="preserve">أ</w:t>
+            </w:r>
+          </w:p>
+        </w:tc>
+        <w:tc>
+          <w:tcPr>
+            <w:tcBorders>
+              <w:top w:color="808080" w:space="0" w:sz="4" w:val="single"/>
+              <w:left w:color="808080" w:space="0" w:sz="4" w:val="single"/>
+              <w:bottom w:color="808080" w:space="0" w:sz="4" w:val="single"/>
+              <w:right w:color="808080" w:space="0" w:sz="4" w:val="single"/>
+            </w:tcBorders>
+            <w:shd w:val="clear" w:color="auto" w:fill="D9EAD3"/>
+            <w:tcMar>
+              <w:top w:w="60.0" w:type="dxa"/>
+              <w:bottom w:w="60.0" w:type="dxa"/>
+            </w:tcMar>
+            <w:vAlign w:val="center"/>
+          </w:tcPr>
+          <w:p>
+            <w:pPr>
+              <w:jc w:val="center"/>
+              <w:rPr>
+                <w:sz w:val="24"/>
+                <w:szCs w:val="24"/>
+              </w:rPr>
+            </w:pPr>
+            <w:r>
+              <w:rPr>
+                <w:b w:val="1"/>
+                <w:bCs w:val="1"/>
+                <w:sz w:val="24"/>
+                <w:szCs w:val="24"/>
+                <w:rtl w:val="1"/>
+              </w:rPr>
+              <w:t xml:space="preserve">أ</w:t>
+            </w:r>
+          </w:p>
+        </w:tc>
+        <w:tc>
+          <w:tcPr>
+            <w:tcBorders>
+              <w:top w:color="808080" w:space="0" w:sz="4" w:val="single"/>
+              <w:left w:color="808080" w:space="0" w:sz="4" w:val="single"/>
+              <w:bottom w:color="808080" w:space="0" w:sz="4" w:val="single"/>
+              <w:right w:color="808080" w:space="0" w:sz="4" w:val="single"/>
+            </w:tcBorders>
+            <w:shd w:val="clear" w:color="auto" w:fill="D9EAD3"/>
+            <w:tcMar>
+              <w:top w:w="60.0" w:type="dxa"/>
+              <w:bottom w:w="60.0" w:type="dxa"/>
+            </w:tcMar>
+            <w:vAlign w:val="center"/>
+          </w:tcPr>
+          <w:p>
+            <w:pPr>
+              <w:jc w:val="center"/>
+              <w:rPr>
+                <w:sz w:val="24"/>
+                <w:szCs w:val="24"/>
+              </w:rPr>
+            </w:pPr>
+            <w:r>
+              <w:rPr>
+                <w:b w:val="1"/>
+                <w:bCs w:val="1"/>
+                <w:sz w:val="24"/>
+                <w:szCs w:val="24"/>
+                <w:rtl w:val="1"/>
+              </w:rPr>
+              <w:t xml:space="preserve">أ</w:t>
+            </w:r>
+          </w:p>
+        </w:tc>
+        <w:tc>
+          <w:tcPr>
+            <w:tcBorders>
+              <w:top w:color="808080" w:space="0" w:sz="4" w:val="single"/>
+              <w:left w:color="808080" w:space="0" w:sz="4" w:val="single"/>
+              <w:bottom w:color="808080" w:space="0" w:sz="4" w:val="single"/>
+              <w:right w:color="808080" w:space="0" w:sz="4" w:val="single"/>
+            </w:tcBorders>
             <w:shd w:val="clear" w:color="auto" w:fill="FFF2CC"/>
             <w:tcMar>
               <w:top w:w="60.0" w:type="dxa"/>
@@ -4334,7 +4463,7 @@
                 <w:szCs w:val="24"/>
                 <w:rtl w:val="1"/>
               </w:rPr>
-              <w:t xml:space="preserve">ب+</w:t>
+              <w:t xml:space="preserve">ب</w:t>
             </w:r>
           </w:p>
         </w:tc>
@@ -4381,111 +4510,6 @@
               <w:bottom w:color="808080" w:space="0" w:sz="4" w:val="single"/>
               <w:right w:color="808080" w:space="0" w:sz="4" w:val="single"/>
             </w:tcBorders>
-            <w:shd w:val="clear" w:color="auto" w:fill="FFF2CC"/>
-            <w:tcMar>
-              <w:top w:w="60.0" w:type="dxa"/>
-              <w:bottom w:w="60.0" w:type="dxa"/>
-            </w:tcMar>
-            <w:vAlign w:val="center"/>
-          </w:tcPr>
-          <w:p>
-            <w:pPr>
-              <w:jc w:val="center"/>
-              <w:rPr>
-                <w:sz w:val="24"/>
-                <w:szCs w:val="24"/>
-              </w:rPr>
-            </w:pPr>
-            <w:r>
-              <w:rPr>
-                <w:b w:val="1"/>
-                <w:bCs w:val="1"/>
-                <w:sz w:val="24"/>
-                <w:szCs w:val="24"/>
-                <w:rtl w:val="1"/>
-              </w:rPr>
-              <w:t xml:space="preserve">ب</w:t>
-            </w:r>
-          </w:p>
-        </w:tc>
-        <w:tc>
-          <w:tcPr>
-            <w:tcBorders>
-              <w:top w:color="808080" w:space="0" w:sz="4" w:val="single"/>
-              <w:left w:color="808080" w:space="0" w:sz="4" w:val="single"/>
-              <w:bottom w:color="808080" w:space="0" w:sz="4" w:val="single"/>
-              <w:right w:color="808080" w:space="0" w:sz="4" w:val="single"/>
-            </w:tcBorders>
-            <w:shd w:val="clear" w:color="auto" w:fill="FFF2CC"/>
-            <w:tcMar>
-              <w:top w:w="60.0" w:type="dxa"/>
-              <w:bottom w:w="60.0" w:type="dxa"/>
-            </w:tcMar>
-            <w:vAlign w:val="center"/>
-          </w:tcPr>
-          <w:p>
-            <w:pPr>
-              <w:jc w:val="center"/>
-              <w:rPr>
-                <w:sz w:val="24"/>
-                <w:szCs w:val="24"/>
-              </w:rPr>
-            </w:pPr>
-            <w:r>
-              <w:rPr>
-                <w:b w:val="1"/>
-                <w:bCs w:val="1"/>
-                <w:sz w:val="24"/>
-                <w:szCs w:val="24"/>
-                <w:rtl w:val="1"/>
-              </w:rPr>
-              <w:t xml:space="preserve">ب</w:t>
-            </w:r>
-          </w:p>
-        </w:tc>
-        <w:tc>
-          <w:tcPr>
-            <w:tcBorders>
-              <w:top w:color="808080" w:space="0" w:sz="4" w:val="single"/>
-              <w:left w:color="808080" w:space="0" w:sz="4" w:val="single"/>
-              <w:bottom w:color="808080" w:space="0" w:sz="4" w:val="single"/>
-              <w:right w:color="808080" w:space="0" w:sz="4" w:val="single"/>
-            </w:tcBorders>
-            <w:shd w:val="clear" w:color="auto" w:fill="FFF2CC"/>
-            <w:tcMar>
-              <w:top w:w="60.0" w:type="dxa"/>
-              <w:bottom w:w="60.0" w:type="dxa"/>
-            </w:tcMar>
-            <w:vAlign w:val="center"/>
-          </w:tcPr>
-          <w:p>
-            <w:pPr>
-              <w:jc w:val="center"/>
-              <w:rPr>
-                <w:sz w:val="24"/>
-                <w:szCs w:val="24"/>
-              </w:rPr>
-            </w:pPr>
-            <w:r>
-              <w:rPr>
-                <w:b w:val="1"/>
-                <w:bCs w:val="1"/>
-                <w:sz w:val="24"/>
-                <w:szCs w:val="24"/>
-                <w:rtl w:val="1"/>
-              </w:rPr>
-              <w:t xml:space="preserve">ب</w:t>
-            </w:r>
-          </w:p>
-        </w:tc>
-        <w:tc>
-          <w:tcPr>
-            <w:tcBorders>
-              <w:top w:color="808080" w:space="0" w:sz="4" w:val="single"/>
-              <w:left w:color="808080" w:space="0" w:sz="4" w:val="single"/>
-              <w:bottom w:color="808080" w:space="0" w:sz="4" w:val="single"/>
-              <w:right w:color="808080" w:space="0" w:sz="4" w:val="single"/>
-            </w:tcBorders>
             <w:shd w:val="clear" w:color="auto" w:fill="D9EAD3"/>
             <w:tcMar>
               <w:top w:w="60.0" w:type="dxa"/>
@@ -4509,41 +4533,41 @@
                 <w:szCs w:val="24"/>
                 <w:rtl w:val="1"/>
               </w:rPr>
-              <w:t xml:space="preserve">أ-</w:t>
-            </w:r>
-          </w:p>
-        </w:tc>
-        <w:tc>
-          <w:tcPr>
-            <w:tcBorders>
-              <w:top w:color="808080" w:space="0" w:sz="4" w:val="single"/>
-              <w:left w:color="808080" w:space="0" w:sz="4" w:val="single"/>
-              <w:bottom w:color="808080" w:space="0" w:sz="4" w:val="single"/>
-              <w:right w:color="808080" w:space="0" w:sz="4" w:val="single"/>
-            </w:tcBorders>
-            <w:tcMar>
-              <w:top w:w="60.0" w:type="dxa"/>
-              <w:bottom w:w="60.0" w:type="dxa"/>
-            </w:tcMar>
-            <w:vAlign w:val="center"/>
-          </w:tcPr>
-          <w:p>
-            <w:pPr>
-              <w:jc w:val="center"/>
-              <w:rPr>
-                <w:sz w:val="24"/>
-                <w:szCs w:val="24"/>
-              </w:rPr>
-            </w:pPr>
-            <w:r>
-              <w:rPr>
-                <w:b w:val="1"/>
-                <w:bCs w:val="1"/>
-                <w:sz w:val="24"/>
-                <w:szCs w:val="24"/>
-                <w:rtl w:val="1"/>
-              </w:rPr>
-              <w:t xml:space="preserve">13</w:t>
+              <w:t xml:space="preserve">أ</w:t>
+            </w:r>
+          </w:p>
+        </w:tc>
+        <w:tc>
+          <w:tcPr>
+            <w:tcBorders>
+              <w:top w:color="808080" w:space="0" w:sz="4" w:val="single"/>
+              <w:left w:color="808080" w:space="0" w:sz="4" w:val="single"/>
+              <w:bottom w:color="808080" w:space="0" w:sz="4" w:val="single"/>
+              <w:right w:color="808080" w:space="0" w:sz="4" w:val="single"/>
+            </w:tcBorders>
+            <w:tcMar>
+              <w:top w:w="60.0" w:type="dxa"/>
+              <w:bottom w:w="60.0" w:type="dxa"/>
+            </w:tcMar>
+            <w:vAlign w:val="center"/>
+          </w:tcPr>
+          <w:p>
+            <w:pPr>
+              <w:jc w:val="center"/>
+              <w:rPr>
+                <w:sz w:val="24"/>
+                <w:szCs w:val="24"/>
+              </w:rPr>
+            </w:pPr>
+            <w:r>
+              <w:rPr>
+                <w:b w:val="1"/>
+                <w:bCs w:val="1"/>
+                <w:sz w:val="24"/>
+                <w:szCs w:val="24"/>
+                <w:rtl w:val="1"/>
+              </w:rPr>
+              <w:t xml:space="preserve">16</w:t>
             </w:r>
           </w:p>
         </w:tc>
@@ -4583,7 +4607,7 @@
                 <w:szCs w:val="24"/>
                 <w:rtl w:val="1"/>
               </w:rPr>
-              <w:t xml:space="preserve">علي صالح</w:t>
+              <w:t xml:space="preserve">علي ناصر</w:t>
             </w:r>
           </w:p>
         </w:tc>
@@ -4618,7 +4642,7 @@
                 <w:szCs w:val="24"/>
                 <w:rtl w:val="1"/>
               </w:rPr>
-              <w:t xml:space="preserve">أ-</w:t>
+              <w:t xml:space="preserve">أ</w:t>
             </w:r>
           </w:p>
         </w:tc>
@@ -4805,41 +4829,6 @@
               <w:bottom w:color="808080" w:space="0" w:sz="4" w:val="single"/>
               <w:right w:color="808080" w:space="0" w:sz="4" w:val="single"/>
             </w:tcBorders>
-            <w:shd w:val="clear" w:color="auto" w:fill="FFF2CC"/>
-            <w:tcMar>
-              <w:top w:w="60.0" w:type="dxa"/>
-              <w:bottom w:w="60.0" w:type="dxa"/>
-            </w:tcMar>
-            <w:vAlign w:val="center"/>
-          </w:tcPr>
-          <w:p>
-            <w:pPr>
-              <w:jc w:val="center"/>
-              <w:rPr>
-                <w:sz w:val="24"/>
-                <w:szCs w:val="24"/>
-              </w:rPr>
-            </w:pPr>
-            <w:r>
-              <w:rPr>
-                <w:b w:val="1"/>
-                <w:bCs w:val="1"/>
-                <w:sz w:val="24"/>
-                <w:szCs w:val="24"/>
-                <w:rtl w:val="1"/>
-              </w:rPr>
-              <w:t xml:space="preserve">ب</w:t>
-            </w:r>
-          </w:p>
-        </w:tc>
-        <w:tc>
-          <w:tcPr>
-            <w:tcBorders>
-              <w:top w:color="808080" w:space="0" w:sz="4" w:val="single"/>
-              <w:left w:color="808080" w:space="0" w:sz="4" w:val="single"/>
-              <w:bottom w:color="808080" w:space="0" w:sz="4" w:val="single"/>
-              <w:right w:color="808080" w:space="0" w:sz="4" w:val="single"/>
-            </w:tcBorders>
             <w:shd w:val="clear" w:color="auto" w:fill="D9EAD3"/>
             <w:tcMar>
               <w:top w:w="60.0" w:type="dxa"/>
@@ -4875,29 +4864,64 @@
               <w:bottom w:color="808080" w:space="0" w:sz="4" w:val="single"/>
               <w:right w:color="808080" w:space="0" w:sz="4" w:val="single"/>
             </w:tcBorders>
-            <w:tcMar>
-              <w:top w:w="60.0" w:type="dxa"/>
-              <w:bottom w:w="60.0" w:type="dxa"/>
-            </w:tcMar>
-            <w:vAlign w:val="center"/>
-          </w:tcPr>
-          <w:p>
-            <w:pPr>
-              <w:jc w:val="center"/>
-              <w:rPr>
-                <w:sz w:val="24"/>
-                <w:szCs w:val="24"/>
-              </w:rPr>
-            </w:pPr>
-            <w:r>
-              <w:rPr>
-                <w:b w:val="1"/>
-                <w:bCs w:val="1"/>
-                <w:sz w:val="24"/>
-                <w:szCs w:val="24"/>
-                <w:rtl w:val="1"/>
-              </w:rPr>
-              <w:t xml:space="preserve">16</w:t>
+            <w:shd w:val="clear" w:color="auto" w:fill="D9EAD3"/>
+            <w:tcMar>
+              <w:top w:w="60.0" w:type="dxa"/>
+              <w:bottom w:w="60.0" w:type="dxa"/>
+            </w:tcMar>
+            <w:vAlign w:val="center"/>
+          </w:tcPr>
+          <w:p>
+            <w:pPr>
+              <w:jc w:val="center"/>
+              <w:rPr>
+                <w:sz w:val="24"/>
+                <w:szCs w:val="24"/>
+              </w:rPr>
+            </w:pPr>
+            <w:r>
+              <w:rPr>
+                <w:b w:val="1"/>
+                <w:bCs w:val="1"/>
+                <w:sz w:val="24"/>
+                <w:szCs w:val="24"/>
+                <w:rtl w:val="1"/>
+              </w:rPr>
+              <w:t xml:space="preserve">أ</w:t>
+            </w:r>
+          </w:p>
+        </w:tc>
+        <w:tc>
+          <w:tcPr>
+            <w:tcBorders>
+              <w:top w:color="808080" w:space="0" w:sz="4" w:val="single"/>
+              <w:left w:color="808080" w:space="0" w:sz="4" w:val="single"/>
+              <w:bottom w:color="808080" w:space="0" w:sz="4" w:val="single"/>
+              <w:right w:color="808080" w:space="0" w:sz="4" w:val="single"/>
+            </w:tcBorders>
+            <w:tcMar>
+              <w:top w:w="60.0" w:type="dxa"/>
+              <w:bottom w:w="60.0" w:type="dxa"/>
+            </w:tcMar>
+            <w:vAlign w:val="center"/>
+          </w:tcPr>
+          <w:p>
+            <w:pPr>
+              <w:jc w:val="center"/>
+              <w:rPr>
+                <w:sz w:val="24"/>
+                <w:szCs w:val="24"/>
+              </w:rPr>
+            </w:pPr>
+            <w:r>
+              <w:rPr>
+                <w:b w:val="1"/>
+                <w:bCs w:val="1"/>
+                <w:sz w:val="24"/>
+                <w:szCs w:val="24"/>
+                <w:rtl w:val="1"/>
+              </w:rPr>
+              <w:t xml:space="preserve">17</w:t>
             </w:r>
           </w:p>
         </w:tc>
@@ -4937,7 +4961,12 @@
                 <w:szCs w:val="24"/>
                 <w:rtl w:val="1"/>
               </w:rPr>
-              <w:t xml:space="preserve">علي ناصر</w:t>
+              <w:t xml:space="preserve">المعدّل</w:t>
+            </w:r>
+            <w:r>
+              <w:rPr>
+                <w:rtl w:val="0"/>
+              </w:rPr>
             </w:r>
           </w:p>
         </w:tc>
@@ -4972,7 +5001,7 @@
                 <w:szCs w:val="24"/>
                 <w:rtl w:val="1"/>
               </w:rPr>
-              <w:t xml:space="preserve">أ-</w:t>
+              <w:t xml:space="preserve">أ</w:t>
             </w:r>
           </w:p>
         </w:tc>
@@ -5007,7 +5036,7 @@
                 <w:szCs w:val="24"/>
                 <w:rtl w:val="1"/>
               </w:rPr>
-              <w:t xml:space="preserve">ب+</w:t>
+              <w:t xml:space="preserve">ب</w:t>
             </w:r>
           </w:p>
         </w:tc>
@@ -5054,6 +5083,41 @@
               <w:bottom w:color="808080" w:space="0" w:sz="4" w:val="single"/>
               <w:right w:color="808080" w:space="0" w:sz="4" w:val="single"/>
             </w:tcBorders>
+            <w:shd w:val="clear" w:color="auto" w:fill="FFF2CC"/>
+            <w:tcMar>
+              <w:top w:w="60.0" w:type="dxa"/>
+              <w:bottom w:w="60.0" w:type="dxa"/>
+            </w:tcMar>
+            <w:vAlign w:val="center"/>
+          </w:tcPr>
+          <w:p>
+            <w:pPr>
+              <w:jc w:val="center"/>
+              <w:rPr>
+                <w:sz w:val="24"/>
+                <w:szCs w:val="24"/>
+              </w:rPr>
+            </w:pPr>
+            <w:r>
+              <w:rPr>
+                <w:b w:val="1"/>
+                <w:bCs w:val="1"/>
+                <w:sz w:val="24"/>
+                <w:szCs w:val="24"/>
+                <w:rtl w:val="1"/>
+              </w:rPr>
+              <w:t xml:space="preserve">ب</w:t>
+            </w:r>
+          </w:p>
+        </w:tc>
+        <w:tc>
+          <w:tcPr>
+            <w:tcBorders>
+              <w:top w:color="808080" w:space="0" w:sz="4" w:val="single"/>
+              <w:left w:color="808080" w:space="0" w:sz="4" w:val="single"/>
+              <w:bottom w:color="808080" w:space="0" w:sz="4" w:val="single"/>
+              <w:right w:color="808080" w:space="0" w:sz="4" w:val="single"/>
+            </w:tcBorders>
             <w:shd w:val="clear" w:color="auto" w:fill="D9EAD3"/>
             <w:tcMar>
               <w:top w:w="60.0" w:type="dxa"/>
@@ -5089,6 +5153,41 @@
               <w:bottom w:color="808080" w:space="0" w:sz="4" w:val="single"/>
               <w:right w:color="808080" w:space="0" w:sz="4" w:val="single"/>
             </w:tcBorders>
+            <w:shd w:val="clear" w:color="auto" w:fill="FFF2CC"/>
+            <w:tcMar>
+              <w:top w:w="60.0" w:type="dxa"/>
+              <w:bottom w:w="60.0" w:type="dxa"/>
+            </w:tcMar>
+            <w:vAlign w:val="center"/>
+          </w:tcPr>
+          <w:p>
+            <w:pPr>
+              <w:jc w:val="center"/>
+              <w:rPr>
+                <w:sz w:val="24"/>
+                <w:szCs w:val="24"/>
+              </w:rPr>
+            </w:pPr>
+            <w:r>
+              <w:rPr>
+                <w:b w:val="1"/>
+                <w:bCs w:val="1"/>
+                <w:sz w:val="24"/>
+                <w:szCs w:val="24"/>
+                <w:rtl w:val="1"/>
+              </w:rPr>
+              <w:t xml:space="preserve">ب</w:t>
+            </w:r>
+          </w:p>
+        </w:tc>
+        <w:tc>
+          <w:tcPr>
+            <w:tcBorders>
+              <w:top w:color="808080" w:space="0" w:sz="4" w:val="single"/>
+              <w:left w:color="808080" w:space="0" w:sz="4" w:val="single"/>
+              <w:bottom w:color="808080" w:space="0" w:sz="4" w:val="single"/>
+              <w:right w:color="808080" w:space="0" w:sz="4" w:val="single"/>
+            </w:tcBorders>
             <w:shd w:val="clear" w:color="auto" w:fill="D9EAD3"/>
             <w:tcMar>
               <w:top w:w="60.0" w:type="dxa"/>
@@ -5124,41 +5223,6 @@
               <w:bottom w:color="808080" w:space="0" w:sz="4" w:val="single"/>
               <w:right w:color="808080" w:space="0" w:sz="4" w:val="single"/>
             </w:tcBorders>
-            <w:shd w:val="clear" w:color="auto" w:fill="FFF2CC"/>
-            <w:tcMar>
-              <w:top w:w="60.0" w:type="dxa"/>
-              <w:bottom w:w="60.0" w:type="dxa"/>
-            </w:tcMar>
-            <w:vAlign w:val="center"/>
-          </w:tcPr>
-          <w:p>
-            <w:pPr>
-              <w:jc w:val="center"/>
-              <w:rPr>
-                <w:sz w:val="24"/>
-                <w:szCs w:val="24"/>
-              </w:rPr>
-            </w:pPr>
-            <w:r>
-              <w:rPr>
-                <w:b w:val="1"/>
-                <w:bCs w:val="1"/>
-                <w:sz w:val="24"/>
-                <w:szCs w:val="24"/>
-                <w:rtl w:val="1"/>
-              </w:rPr>
-              <w:t xml:space="preserve">ب</w:t>
-            </w:r>
-          </w:p>
-        </w:tc>
-        <w:tc>
-          <w:tcPr>
-            <w:tcBorders>
-              <w:top w:color="808080" w:space="0" w:sz="4" w:val="single"/>
-              <w:left w:color="808080" w:space="0" w:sz="4" w:val="single"/>
-              <w:bottom w:color="808080" w:space="0" w:sz="4" w:val="single"/>
-              <w:right w:color="808080" w:space="0" w:sz="4" w:val="single"/>
-            </w:tcBorders>
             <w:shd w:val="clear" w:color="auto" w:fill="D9EAD3"/>
             <w:tcMar>
               <w:top w:w="60.0" w:type="dxa"/>
@@ -5183,376 +5247,6 @@
                 <w:rtl w:val="1"/>
               </w:rPr>
               <w:t xml:space="preserve">أ</w:t>
-            </w:r>
-          </w:p>
-        </w:tc>
-        <w:tc>
-          <w:tcPr>
-            <w:tcBorders>
-              <w:top w:color="808080" w:space="0" w:sz="4" w:val="single"/>
-              <w:left w:color="808080" w:space="0" w:sz="4" w:val="single"/>
-              <w:bottom w:color="808080" w:space="0" w:sz="4" w:val="single"/>
-              <w:right w:color="808080" w:space="0" w:sz="4" w:val="single"/>
-            </w:tcBorders>
-            <w:shd w:val="clear" w:color="auto" w:fill="D9EAD3"/>
-            <w:tcMar>
-              <w:top w:w="60.0" w:type="dxa"/>
-              <w:bottom w:w="60.0" w:type="dxa"/>
-            </w:tcMar>
-            <w:vAlign w:val="center"/>
-          </w:tcPr>
-          <w:p>
-            <w:pPr>
-              <w:jc w:val="center"/>
-              <w:rPr>
-                <w:sz w:val="24"/>
-                <w:szCs w:val="24"/>
-              </w:rPr>
-            </w:pPr>
-            <w:r>
-              <w:rPr>
-                <w:b w:val="1"/>
-                <w:bCs w:val="1"/>
-                <w:sz w:val="24"/>
-                <w:szCs w:val="24"/>
-                <w:rtl w:val="1"/>
-              </w:rPr>
-              <w:t xml:space="preserve">أ-</w:t>
-            </w:r>
-          </w:p>
-        </w:tc>
-        <w:tc>
-          <w:tcPr>
-            <w:tcBorders>
-              <w:top w:color="808080" w:space="0" w:sz="4" w:val="single"/>
-              <w:left w:color="808080" w:space="0" w:sz="4" w:val="single"/>
-              <w:bottom w:color="808080" w:space="0" w:sz="4" w:val="single"/>
-              <w:right w:color="808080" w:space="0" w:sz="4" w:val="single"/>
-            </w:tcBorders>
-            <w:tcMar>
-              <w:top w:w="60.0" w:type="dxa"/>
-              <w:bottom w:w="60.0" w:type="dxa"/>
-            </w:tcMar>
-            <w:vAlign w:val="center"/>
-          </w:tcPr>
-          <w:p>
-            <w:pPr>
-              <w:jc w:val="center"/>
-              <w:rPr>
-                <w:sz w:val="24"/>
-                <w:szCs w:val="24"/>
-              </w:rPr>
-            </w:pPr>
-            <w:r>
-              <w:rPr>
-                <w:b w:val="1"/>
-                <w:bCs w:val="1"/>
-                <w:sz w:val="24"/>
-                <w:szCs w:val="24"/>
-                <w:rtl w:val="1"/>
-              </w:rPr>
-              <w:t xml:space="preserve">17</w:t>
-            </w:r>
-          </w:p>
-        </w:tc>
-      </w:tr>
-      <w:tr>
-        <w:trPr>
-          <w:cantSplit w:val="0"/>
-          <w:tblHeader w:val="0"/>
-        </w:trPr>
-        <w:tc>
-          <w:tcPr>
-            <w:tcBorders>
-              <w:top w:color="808080" w:space="0" w:sz="4" w:val="single"/>
-              <w:left w:color="808080" w:space="0" w:sz="4" w:val="single"/>
-              <w:bottom w:color="808080" w:space="0" w:sz="4" w:val="single"/>
-              <w:right w:color="808080" w:space="0" w:sz="4" w:val="single"/>
-            </w:tcBorders>
-            <w:tcMar>
-              <w:top w:w="60.0" w:type="dxa"/>
-              <w:bottom w:w="60.0" w:type="dxa"/>
-            </w:tcMar>
-            <w:vAlign w:val="center"/>
-          </w:tcPr>
-          <w:p>
-            <w:pPr>
-              <w:jc w:val="center"/>
-              <w:rPr>
-                <w:sz w:val="24"/>
-                <w:szCs w:val="24"/>
-              </w:rPr>
-            </w:pPr>
-            <w:r>
-              <w:rPr>
-                <w:b w:val="1"/>
-                <w:bCs w:val="1"/>
-                <w:sz w:val="24"/>
-                <w:szCs w:val="24"/>
-                <w:rtl w:val="1"/>
-              </w:rPr>
-              <w:t xml:space="preserve">المعدّل</w:t>
-            </w:r>
-            <w:r>
-              <w:rPr>
-                <w:rtl w:val="0"/>
-              </w:rPr>
-            </w:r>
-          </w:p>
-        </w:tc>
-        <w:tc>
-          <w:tcPr>
-            <w:tcBorders>
-              <w:top w:color="808080" w:space="0" w:sz="4" w:val="single"/>
-              <w:left w:color="808080" w:space="0" w:sz="4" w:val="single"/>
-              <w:bottom w:color="808080" w:space="0" w:sz="4" w:val="single"/>
-              <w:right w:color="808080" w:space="0" w:sz="4" w:val="single"/>
-            </w:tcBorders>
-            <w:tcMar>
-              <w:top w:w="60.0" w:type="dxa"/>
-              <w:bottom w:w="60.0" w:type="dxa"/>
-            </w:tcMar>
-            <w:vAlign w:val="center"/>
-          </w:tcPr>
-          <w:p>
-            <w:pPr>
-              <w:jc w:val="center"/>
-              <w:rPr>
-                <w:sz w:val="24"/>
-                <w:szCs w:val="24"/>
-              </w:rPr>
-            </w:pPr>
-            <w:r>
-              <w:rPr>
-                <w:sz w:val="24"/>
-                <w:szCs w:val="24"/>
-                <w:rtl w:val="1"/>
-              </w:rPr>
-              <w:t xml:space="preserve">3.06</w:t>
-            </w:r>
-          </w:p>
-        </w:tc>
-        <w:tc>
-          <w:tcPr>
-            <w:tcBorders>
-              <w:top w:color="808080" w:space="0" w:sz="4" w:val="single"/>
-              <w:left w:color="808080" w:space="0" w:sz="4" w:val="single"/>
-              <w:bottom w:color="808080" w:space="0" w:sz="4" w:val="single"/>
-              <w:right w:color="808080" w:space="0" w:sz="4" w:val="single"/>
-            </w:tcBorders>
-            <w:tcMar>
-              <w:top w:w="60.0" w:type="dxa"/>
-              <w:bottom w:w="60.0" w:type="dxa"/>
-            </w:tcMar>
-            <w:vAlign w:val="center"/>
-          </w:tcPr>
-          <w:p>
-            <w:pPr>
-              <w:jc w:val="center"/>
-              <w:rPr>
-                <w:sz w:val="24"/>
-                <w:szCs w:val="24"/>
-              </w:rPr>
-            </w:pPr>
-            <w:r>
-              <w:rPr>
-                <w:sz w:val="24"/>
-                <w:szCs w:val="24"/>
-                <w:rtl w:val="1"/>
-              </w:rPr>
-              <w:t xml:space="preserve">2.00</w:t>
-            </w:r>
-          </w:p>
-        </w:tc>
-        <w:tc>
-          <w:tcPr>
-            <w:tcBorders>
-              <w:top w:color="808080" w:space="0" w:sz="4" w:val="single"/>
-              <w:left w:color="808080" w:space="0" w:sz="4" w:val="single"/>
-              <w:bottom w:color="808080" w:space="0" w:sz="4" w:val="single"/>
-              <w:right w:color="808080" w:space="0" w:sz="4" w:val="single"/>
-            </w:tcBorders>
-            <w:tcMar>
-              <w:top w:w="60.0" w:type="dxa"/>
-              <w:bottom w:w="60.0" w:type="dxa"/>
-            </w:tcMar>
-            <w:vAlign w:val="center"/>
-          </w:tcPr>
-          <w:p>
-            <w:pPr>
-              <w:jc w:val="center"/>
-              <w:rPr>
-                <w:sz w:val="24"/>
-                <w:szCs w:val="24"/>
-              </w:rPr>
-            </w:pPr>
-            <w:r>
-              <w:rPr>
-                <w:sz w:val="24"/>
-                <w:szCs w:val="24"/>
-                <w:rtl w:val="1"/>
-              </w:rPr>
-              <w:t xml:space="preserve">1.31</w:t>
-            </w:r>
-          </w:p>
-        </w:tc>
-        <w:tc>
-          <w:tcPr>
-            <w:tcBorders>
-              <w:top w:color="808080" w:space="0" w:sz="4" w:val="single"/>
-              <w:left w:color="808080" w:space="0" w:sz="4" w:val="single"/>
-              <w:bottom w:color="808080" w:space="0" w:sz="4" w:val="single"/>
-              <w:right w:color="808080" w:space="0" w:sz="4" w:val="single"/>
-            </w:tcBorders>
-            <w:tcMar>
-              <w:top w:w="60.0" w:type="dxa"/>
-              <w:bottom w:w="60.0" w:type="dxa"/>
-            </w:tcMar>
-            <w:vAlign w:val="center"/>
-          </w:tcPr>
-          <w:p>
-            <w:pPr>
-              <w:jc w:val="center"/>
-              <w:rPr>
-                <w:sz w:val="24"/>
-                <w:szCs w:val="24"/>
-              </w:rPr>
-            </w:pPr>
-            <w:r>
-              <w:rPr>
-                <w:sz w:val="24"/>
-                <w:szCs w:val="24"/>
-                <w:rtl w:val="1"/>
-              </w:rPr>
-              <w:t xml:space="preserve">1.50</w:t>
-            </w:r>
-          </w:p>
-        </w:tc>
-        <w:tc>
-          <w:tcPr>
-            <w:tcBorders>
-              <w:top w:color="808080" w:space="0" w:sz="4" w:val="single"/>
-              <w:left w:color="808080" w:space="0" w:sz="4" w:val="single"/>
-              <w:bottom w:color="808080" w:space="0" w:sz="4" w:val="single"/>
-              <w:right w:color="808080" w:space="0" w:sz="4" w:val="single"/>
-            </w:tcBorders>
-            <w:tcMar>
-              <w:top w:w="60.0" w:type="dxa"/>
-              <w:bottom w:w="60.0" w:type="dxa"/>
-            </w:tcMar>
-            <w:vAlign w:val="center"/>
-          </w:tcPr>
-          <w:p>
-            <w:pPr>
-              <w:jc w:val="center"/>
-              <w:rPr>
-                <w:sz w:val="24"/>
-                <w:szCs w:val="24"/>
-              </w:rPr>
-            </w:pPr>
-            <w:r>
-              <w:rPr>
-                <w:sz w:val="24"/>
-                <w:szCs w:val="24"/>
-                <w:rtl w:val="1"/>
-              </w:rPr>
-              <w:t xml:space="preserve">0.94</w:t>
-            </w:r>
-          </w:p>
-        </w:tc>
-        <w:tc>
-          <w:tcPr>
-            <w:tcBorders>
-              <w:top w:color="808080" w:space="0" w:sz="4" w:val="single"/>
-              <w:left w:color="808080" w:space="0" w:sz="4" w:val="single"/>
-              <w:bottom w:color="808080" w:space="0" w:sz="4" w:val="single"/>
-              <w:right w:color="808080" w:space="0" w:sz="4" w:val="single"/>
-            </w:tcBorders>
-            <w:tcMar>
-              <w:top w:w="60.0" w:type="dxa"/>
-              <w:bottom w:w="60.0" w:type="dxa"/>
-            </w:tcMar>
-            <w:vAlign w:val="center"/>
-          </w:tcPr>
-          <w:p>
-            <w:pPr>
-              <w:jc w:val="center"/>
-              <w:rPr>
-                <w:sz w:val="24"/>
-                <w:szCs w:val="24"/>
-              </w:rPr>
-            </w:pPr>
-            <w:r>
-              <w:rPr>
-                <w:sz w:val="24"/>
-                <w:szCs w:val="24"/>
-                <w:rtl w:val="1"/>
-              </w:rPr>
-              <w:t xml:space="preserve">1.06</w:t>
-            </w:r>
-          </w:p>
-        </w:tc>
-        <w:tc>
-          <w:tcPr>
-            <w:tcBorders>
-              <w:top w:color="808080" w:space="0" w:sz="4" w:val="single"/>
-              <w:left w:color="808080" w:space="0" w:sz="4" w:val="single"/>
-              <w:bottom w:color="808080" w:space="0" w:sz="4" w:val="single"/>
-              <w:right w:color="808080" w:space="0" w:sz="4" w:val="single"/>
-            </w:tcBorders>
-            <w:tcMar>
-              <w:top w:w="60.0" w:type="dxa"/>
-              <w:bottom w:w="60.0" w:type="dxa"/>
-            </w:tcMar>
-            <w:vAlign w:val="center"/>
-          </w:tcPr>
-          <w:p>
-            <w:pPr>
-              <w:jc w:val="center"/>
-              <w:rPr>
-                <w:sz w:val="24"/>
-                <w:szCs w:val="24"/>
-              </w:rPr>
-            </w:pPr>
-            <w:r>
-              <w:rPr>
-                <w:sz w:val="24"/>
-                <w:szCs w:val="24"/>
-                <w:rtl w:val="1"/>
-              </w:rPr>
-              <w:t xml:space="preserve">1.75</w:t>
-            </w:r>
-          </w:p>
-        </w:tc>
-        <w:tc>
-          <w:tcPr>
-            <w:tcBorders>
-              <w:top w:color="808080" w:space="0" w:sz="4" w:val="single"/>
-              <w:left w:color="808080" w:space="0" w:sz="4" w:val="single"/>
-              <w:bottom w:color="808080" w:space="0" w:sz="4" w:val="single"/>
-              <w:right w:color="808080" w:space="0" w:sz="4" w:val="single"/>
-            </w:tcBorders>
-            <w:tcMar>
-              <w:top w:w="60.0" w:type="dxa"/>
-              <w:bottom w:w="60.0" w:type="dxa"/>
-            </w:tcMar>
-            <w:vAlign w:val="center"/>
-          </w:tcPr>
-          <w:p>
-            <w:pPr>
-              <w:jc w:val="center"/>
-              <w:rPr>
-                <w:sz w:val="24"/>
-                <w:szCs w:val="24"/>
-              </w:rPr>
-            </w:pPr>
-            <w:r>
-              <w:rPr>
-                <w:sz w:val="24"/>
-                <w:szCs w:val="24"/>
-                <w:rtl w:val="1"/>
-              </w:rPr>
-              <w:t xml:space="preserve">4.69</w:t>
             </w:r>
           </w:p>
         </w:tc>
@@ -6136,7 +5830,7 @@
           <w:szCs w:val="24"/>
           <w:rtl w:val="1"/>
         </w:rPr>
-        <w:t xml:space="preserve">- أهداف متحققة بدرجة ممتازة: </w:t>
+        <w:t xml:space="preserve">- أهداف متحققة لدى جميع التلاميذ أو معظمهم (فئة أ): </w:t>
       </w:r>
       <w:r>
         <w:rPr>
@@ -6144,7 +5838,7 @@
           <w:szCs w:val="24"/>
           <w:rtl w:val="1"/>
         </w:rPr>
-        <w:t xml:space="preserve">الهدف 5 (التقريب) بنسبة 93.8% (7 تلاميذ بفئة أ)، والهدف 8 (المثلثات) بنسبة 93.8% (جميع التلاميذ بين أ وأ-)، والأهداف 1 (صح أم خطأ) و3 (الكسر العشري) و7 (ق.م.أك وم.م.أص) بنسبة 87.5% لكل منها.</w:t>
+        <w:t xml:space="preserve">الهدف 8 (المثلثات): 8 تلاميذ أ؛ الهدف 1 (صح أم خطأ) والهدف 5 (التقريب): 7 تلاميذ أ وتلميذ واحد ب؛ الهدف 7 (ق.م.أك وم.م.أص): 6 أ و2 ب؛ الهدف 3 (الكسر العشري): 5 أ و3 ب.</w:t>
       </w:r>
     </w:p>
     <w:p>
@@ -6166,7 +5860,7 @@
           <w:szCs w:val="24"/>
           <w:rtl w:val="1"/>
         </w:rPr>
-        <w:t xml:space="preserve">- هدف متحقق بدرجة جيدة: </w:t>
+        <w:t xml:space="preserve">- هدف متحقق جزئياً: </w:t>
       </w:r>
       <w:r>
         <w:rPr>
@@ -6174,7 +5868,7 @@
           <w:szCs w:val="24"/>
           <w:rtl w:val="1"/>
         </w:rPr>
-        <w:t xml:space="preserve">الهدف 4 (العمليات على الأعداد الكسرية والعشرية) بنسبة 75%؛ نصف التلاميذ (4) بفئة ب بسبب أخطاء في جمع عدد صحيح مع كسر (3 + 2/5) أو في محاذاة الفاصلة العشرية.</w:t>
+        <w:t xml:space="preserve">الهدف 4 (العمليات على الأعداد الكسرية والعشرية): 4 تلاميذ أ و4 تلاميذ ب، والأخطاء في جمع عدد صحيح مع كسر وفي محاذاة الفاصلة العشرية.</w:t>
       </w:r>
     </w:p>
     <w:p>
@@ -6196,7 +5890,7 @@
           <w:szCs w:val="24"/>
           <w:rtl w:val="1"/>
         </w:rPr>
-        <w:t xml:space="preserve">- أهداف ضعيفة التحقق: </w:t>
+        <w:t xml:space="preserve">- أهداف ضعيفة التحقق (غالبية ب): </w:t>
       </w:r>
       <w:r>
         <w:rPr>
@@ -6204,7 +5898,7 @@
           <w:szCs w:val="24"/>
           <w:rtl w:val="1"/>
         </w:rPr>
-        <w:t xml:space="preserve">الهدف 2 (الأسعار والتخفيض بنسبة مئوية) بنسبة 66.7% (4 تلاميذ ب و2 ب+)، والهدف 6 (شعاع الدائرة والوتر) وهو الأضعف بنسبة 53.1% (6 تلاميذ ب وتلميذ ب-، وتلميذ واحد فقط بفئة أ).</w:t>
+        <w:t xml:space="preserve">الهدف 2 (الأسعار والتخفيض بنسبة مئوية): 2 أ و6 ب؛ والهدف 6 (شعاع الدائرة والوتر) وهو الأضعف: تلميذ واحد أ و7 تلاميذ ب.</w:t>
       </w:r>
     </w:p>
     <w:p>
@@ -6234,7 +5928,7 @@
           <w:szCs w:val="24"/>
           <w:rtl w:val="1"/>
         </w:rPr>
-        <w:t xml:space="preserve">لم يحصل أي تلميذ على الفئة ج في أي هدف، ما يدل على أن جميع التلاميذ يمتلكون الحد الأدنى من المكتسبات المطلوبة.</w:t>
+        <w:t xml:space="preserve">لم يحصل أي تلميذ على الفئة ج في أي هدف، ما يدل على امتلاك جميع التلاميذ الحد الأدنى من المكتسبات المطلوبة.</w:t>
       </w:r>
     </w:p>
     <w:p>
@@ -6281,7 +5975,7 @@
           <w:szCs w:val="24"/>
           <w:rtl w:val="1"/>
         </w:rPr>
-        <w:t xml:space="preserve">- مستوى ممتاز: </w:t>
+        <w:t xml:space="preserve">- تحقيق جميع الأهداف أو معظمها: </w:t>
       </w:r>
       <w:r>
         <w:rPr>
@@ -6289,7 +5983,7 @@
           <w:szCs w:val="24"/>
           <w:rtl w:val="1"/>
         </w:rPr>
-        <w:t xml:space="preserve">خليل السبليني (20/20) حقّق جميع الأهداف بفئة أ، واحمد بصل (19/20) حقّق 7 أهداف بفئة أ مع ب في الهدف 6 فقط.</w:t>
+        <w:t xml:space="preserve">خليل السبليني حقّق الأهداف الثمانية بفئة أ، واحمد بصل حقّق 7 أهداف بفئة أ (ب في الهدف 6).</w:t>
       </w:r>
     </w:p>
     <w:p>
@@ -6311,7 +6005,7 @@
           <w:szCs w:val="24"/>
           <w:rtl w:val="1"/>
         </w:rPr>
-        <w:t xml:space="preserve">- مستوى جيد جداً: </w:t>
+        <w:t xml:space="preserve">- تحقيق جيد: </w:t>
       </w:r>
       <w:r>
         <w:rPr>
@@ -6319,7 +6013,7 @@
           <w:szCs w:val="24"/>
           <w:rtl w:val="1"/>
         </w:rPr>
-        <w:t xml:space="preserve">علي ناصر (17)، ابراهيم صيدح (16)، علي صالح (16): تحقق معظم الأهداف مع ثغرات في الهدفين 2 و6، وفي الهدف 4 لإبراهيم والهدف 7 لعلي صالح.</w:t>
+        <w:t xml:space="preserve">علي ناصر (6 أ و2 ب في الهدفين 2 و6)، علي صالح (5 أ و3 ب في الأهداف 2، 6، 7)، ابراهيم صيدح (5 أ و3 ب في الأهداف 2، 4، 6).</w:t>
       </w:r>
     </w:p>
     <w:p>
@@ -6341,7 +6035,7 @@
           <w:szCs w:val="24"/>
           <w:rtl w:val="1"/>
         </w:rPr>
-        <w:t xml:space="preserve">- مستوى جيد / يحتاج متابعة: </w:t>
+        <w:t xml:space="preserve">- يحتاج متابعة: </w:t>
       </w:r>
       <w:r>
         <w:rPr>
@@ -6349,7 +6043,7 @@
           <w:szCs w:val="24"/>
           <w:rtl w:val="1"/>
         </w:rPr>
-        <w:t xml:space="preserve">مريم فخر الدين (15.5)، فضل ملك (14)، فاطمة فردون (13): تكررت الفئة ب في الأهداف 2، 3، 4، 6؛ وفاطمة فردون نالت الفئة ب في 6 أهداف من 8، وفضل ملك نال ب- في الهدف 6.</w:t>
+        <w:t xml:space="preserve">مريم فخر الدين (4 أ و4 ب)، فضل ملك (3 أ و5 ب)، فاطمة فردون (2 أ و6 ب)؛ وتتكرر الفئة ب لديهم في الأهداف 2، 3، 4، 6.</w:t>
       </w:r>
     </w:p>
     <w:p>
@@ -6379,7 +6073,7 @@
           <w:szCs w:val="24"/>
           <w:rtl w:val="1"/>
         </w:rPr>
-        <w:t xml:space="preserve">نسبة النجاح 100% (8/8 تلاميذ فوق 10/20)، والمعدل الوسطي 16.31/20 أي 81.56/100، وتراوحت العلامات بين 13 و20.</w:t>
+        <w:t xml:space="preserve">نسبة النجاح 100% (8/8 تلاميذ)، والمعدل الوسطي 81.56/100، ولا توجد أي فئة ج لدى أي تلميذ.</w:t>
       </w:r>
     </w:p>
     <w:p>
@@ -6498,7 +6192,7 @@
           <w:szCs w:val="24"/>
           <w:rtl w:val="1"/>
         </w:rPr>
-        <w:t xml:space="preserve">تمارين على حساب قيمة التخفيض والسعر الجديد ومسائل حياتية متعددة الخطوات، للتلاميذ: فضل، مريم، فاطمة، علي صالح، ابراهيم، علي ناصر.</w:t>
+        <w:t xml:space="preserve">تمارين على حساب قيمة التخفيض والسعر الجديد ومسائل حياتية متعددة الخطوات، للتلاميذ: ابراهيم، فضل، مريم، فاطمة، علي صالح، علي ناصر.</w:t>
       </w:r>
     </w:p>
     <w:p>

</xml_diff>

<commit_message>
Shorten diagnostic grid analysis
Co-Authored-By: Claude Opus 5.5 <noreply@anthropic.com>
Claude-Session: https://claude.ai/code/session_0191GkvowkQwD7tFy4wy6pBY
</commit_message>
<xml_diff>
--- a/شبكة-التشخيصي-رياضيات-السابع-نور.docx
+++ b/شبكة-التشخيصي-رياضيات-السابع-نور.docx
@@ -5830,7 +5830,7 @@
           <w:szCs w:val="24"/>
           <w:rtl w:val="1"/>
         </w:rPr>
-        <w:t xml:space="preserve">- أهداف متحققة لدى جميع التلاميذ أو معظمهم (فئة أ): </w:t>
+        <w:t xml:space="preserve">- أهداف متحققة بشكل جيد: </w:t>
       </w:r>
       <w:r>
         <w:rPr>
@@ -5838,7 +5838,7 @@
           <w:szCs w:val="24"/>
           <w:rtl w:val="1"/>
         </w:rPr>
-        <w:t xml:space="preserve">الهدف 8 (المثلثات): 8 تلاميذ أ؛ الهدف 1 (صح أم خطأ) والهدف 5 (التقريب): 7 تلاميذ أ وتلميذ واحد ب؛ الهدف 7 (ق.م.أك وم.م.أص): 6 أ و2 ب؛ الهدف 3 (الكسر العشري): 5 أ و3 ب.</w:t>
+        <w:t xml:space="preserve">1، 3، 5، 7، 8 (غالبية التلاميذ أ).</w:t>
       </w:r>
     </w:p>
     <w:p>
@@ -5868,7 +5868,7 @@
           <w:szCs w:val="24"/>
           <w:rtl w:val="1"/>
         </w:rPr>
-        <w:t xml:space="preserve">الهدف 4 (العمليات على الأعداد الكسرية والعشرية): 4 تلاميذ أ و4 تلاميذ ب، والأخطاء في جمع عدد صحيح مع كسر وفي محاذاة الفاصلة العشرية.</w:t>
+        <w:t xml:space="preserve">4 (العمليات على الكسور والأعداد العشرية).</w:t>
       </w:r>
     </w:p>
     <w:p>
@@ -5890,7 +5890,7 @@
           <w:szCs w:val="24"/>
           <w:rtl w:val="1"/>
         </w:rPr>
-        <w:t xml:space="preserve">- أهداف ضعيفة التحقق (غالبية ب): </w:t>
+        <w:t xml:space="preserve">- أهداف ضعيفة التحقق: </w:t>
       </w:r>
       <w:r>
         <w:rPr>
@@ -5898,7 +5898,7 @@
           <w:szCs w:val="24"/>
           <w:rtl w:val="1"/>
         </w:rPr>
-        <w:t xml:space="preserve">الهدف 2 (الأسعار والتخفيض بنسبة مئوية): 2 أ و6 ب؛ والهدف 6 (شعاع الدائرة والوتر) وهو الأضعف: تلميذ واحد أ و7 تلاميذ ب.</w:t>
+        <w:t xml:space="preserve">2 (النسبة المئوية) و6 (الشعاع والوتر في الدائرة).</w:t>
       </w:r>
     </w:p>
     <w:p>
@@ -5914,21 +5914,11 @@
       </w:pPr>
       <w:r>
         <w:rPr>
-          <w:b w:val="1"/>
-          <w:bCs w:val="1"/>
           <w:sz w:val="24"/>
           <w:szCs w:val="24"/>
           <w:rtl w:val="1"/>
         </w:rPr>
-        <w:t xml:space="preserve">- ملاحظة: </w:t>
-      </w:r>
-      <w:r>
-        <w:rPr>
-          <w:sz w:val="24"/>
-          <w:szCs w:val="24"/>
-          <w:rtl w:val="1"/>
-        </w:rPr>
-        <w:t xml:space="preserve">لم يحصل أي تلميذ على الفئة ج في أي هدف، ما يدل على امتلاك جميع التلاميذ الحد الأدنى من المكتسبات المطلوبة.</w:t>
+        <w:t xml:space="preserve">لا توجد فئة ج في أي هدف.</w:t>
       </w:r>
     </w:p>
     <w:p>
@@ -5975,7 +5965,7 @@
           <w:szCs w:val="24"/>
           <w:rtl w:val="1"/>
         </w:rPr>
-        <w:t xml:space="preserve">- تحقيق جميع الأهداف أو معظمها: </w:t>
+        <w:t xml:space="preserve">- متمكّنون: </w:t>
       </w:r>
       <w:r>
         <w:rPr>
@@ -5983,7 +5973,7 @@
           <w:szCs w:val="24"/>
           <w:rtl w:val="1"/>
         </w:rPr>
-        <w:t xml:space="preserve">خليل السبليني حقّق الأهداف الثمانية بفئة أ، واحمد بصل حقّق 7 أهداف بفئة أ (ب في الهدف 6).</w:t>
+        <w:t xml:space="preserve">خليل السبليني، احمد بصل.</w:t>
       </w:r>
     </w:p>
     <w:p>
@@ -6005,7 +5995,7 @@
           <w:szCs w:val="24"/>
           <w:rtl w:val="1"/>
         </w:rPr>
-        <w:t xml:space="preserve">- تحقيق جيد: </w:t>
+        <w:t xml:space="preserve">- جيد مع ثغرات بسيطة: </w:t>
       </w:r>
       <w:r>
         <w:rPr>
@@ -6013,7 +6003,7 @@
           <w:szCs w:val="24"/>
           <w:rtl w:val="1"/>
         </w:rPr>
-        <w:t xml:space="preserve">علي ناصر (6 أ و2 ب في الهدفين 2 و6)، علي صالح (5 أ و3 ب في الأهداف 2، 6، 7)، ابراهيم صيدح (5 أ و3 ب في الأهداف 2، 4، 6).</w:t>
+        <w:t xml:space="preserve">علي ناصر، علي صالح، ابراهيم صيدح.</w:t>
       </w:r>
     </w:p>
     <w:p>
@@ -6035,7 +6025,7 @@
           <w:szCs w:val="24"/>
           <w:rtl w:val="1"/>
         </w:rPr>
-        <w:t xml:space="preserve">- يحتاج متابعة: </w:t>
+        <w:t xml:space="preserve">- بحاجة إلى متابعة: </w:t>
       </w:r>
       <w:r>
         <w:rPr>
@@ -6043,37 +6033,7 @@
           <w:szCs w:val="24"/>
           <w:rtl w:val="1"/>
         </w:rPr>
-        <w:t xml:space="preserve">مريم فخر الدين (4 أ و4 ب)، فضل ملك (3 أ و5 ب)، فاطمة فردون (2 أ و6 ب)؛ وتتكرر الفئة ب لديهم في الأهداف 2، 3، 4، 6.</w:t>
-      </w:r>
-    </w:p>
-    <w:p>
-      <w:pPr>
-        <w:bidi w:val="1"/>
-        <w:spacing w:after="60" w:line="276" w:lineRule="auto"/>
-        <w:ind w:left="-180" w:right="180" w:firstLine="0"/>
-        <w:jc w:val="both"/>
-        <w:rPr>
-          <w:sz w:val="24"/>
-          <w:szCs w:val="24"/>
-        </w:rPr>
-      </w:pPr>
-      <w:r>
-        <w:rPr>
-          <w:b w:val="1"/>
-          <w:bCs w:val="1"/>
-          <w:sz w:val="24"/>
-          <w:szCs w:val="24"/>
-          <w:rtl w:val="1"/>
-        </w:rPr>
-        <w:t xml:space="preserve">- النتيجة العامة: </w:t>
-      </w:r>
-      <w:r>
-        <w:rPr>
-          <w:sz w:val="24"/>
-          <w:szCs w:val="24"/>
-          <w:rtl w:val="1"/>
-        </w:rPr>
-        <w:t xml:space="preserve">نسبة النجاح 100% (8/8 تلاميذ)، والمعدل الوسطي 81.56/100، ولا توجد أي فئة ج لدى أي تلميذ.</w:t>
+        <w:t xml:space="preserve">مريم فخر الدين، فضل ملك، فاطمة فردون.</w:t>
       </w:r>
     </w:p>
     <w:p>
@@ -6132,7 +6092,7 @@
           <w:szCs w:val="24"/>
           <w:rtl w:val="1"/>
         </w:rPr>
-        <w:t xml:space="preserve">مستوى الصف جيد جداً عموماً، والمكتسبات الأساسية متحققة لدى جميع التلاميذ، مع حاجة إلى دعم في الأهداف التالية:</w:t>
+        <w:t xml:space="preserve">مستوى الصف جيد جداً (نسبة النجاح 100%، المعدل 81.56/100). أهداف خطة الدعم:</w:t>
       </w:r>
     </w:p>
     <w:p>
@@ -6154,7 +6114,7 @@
           <w:szCs w:val="24"/>
           <w:rtl w:val="1"/>
         </w:rPr>
-        <w:t xml:space="preserve">1- الهدف 6 (الدائرة): </w:t>
+        <w:t xml:space="preserve">1- الهدف 6: </w:t>
       </w:r>
       <w:r>
         <w:rPr>
@@ -6162,7 +6122,7 @@
           <w:szCs w:val="24"/>
           <w:rtl w:val="1"/>
         </w:rPr>
-        <w:t xml:space="preserve">دعم جماعي لكامل الصف (عدا خليل) حول التمييز بين القطر والشعاع والوتر، وأن الشعاع نصف القطر، وحساب كسر من عدد (ثلثا القطر)، عبر أنشطة رسم وقياس.</w:t>
+        <w:t xml:space="preserve">التمييز بين القطر والشعاع والوتر وحساب أطوالها (لكامل الصف).</w:t>
       </w:r>
     </w:p>
     <w:p>
@@ -6184,7 +6144,7 @@
           <w:szCs w:val="24"/>
           <w:rtl w:val="1"/>
         </w:rPr>
-        <w:t xml:space="preserve">2- الهدف 2 (النسبة المئوية): </w:t>
+        <w:t xml:space="preserve">2- الهدف 2: </w:t>
       </w:r>
       <w:r>
         <w:rPr>
@@ -6192,7 +6152,7 @@
           <w:szCs w:val="24"/>
           <w:rtl w:val="1"/>
         </w:rPr>
-        <w:t xml:space="preserve">تمارين على حساب قيمة التخفيض والسعر الجديد ومسائل حياتية متعددة الخطوات، للتلاميذ: ابراهيم، فضل، مريم، فاطمة، علي صالح، علي ناصر.</w:t>
+        <w:t xml:space="preserve">حساب التخفيض بنسبة مئوية في مسائل حياتية.</w:t>
       </w:r>
     </w:p>
     <w:p>
@@ -6214,7 +6174,7 @@
           <w:szCs w:val="24"/>
           <w:rtl w:val="1"/>
         </w:rPr>
-        <w:t xml:space="preserve">3- الهدف 4 (العمليات): </w:t>
+        <w:t xml:space="preserve">3- الهدفان 3 و4: </w:t>
       </w:r>
       <w:r>
         <w:rPr>
@@ -6222,7 +6182,7 @@
           <w:szCs w:val="24"/>
           <w:rtl w:val="1"/>
         </w:rPr>
-        <w:t xml:space="preserve">تثبيت تحويل العدد الصحيح إلى كسر وجمع الكسور، ومحاذاة الفاصلة عند جمع الأعداد العشرية، للتلاميذ: ابراهيم، فضل، مريم، فاطمة.</w:t>
+        <w:t xml:space="preserve">الكسر العشري والعمليات على الكسور والأعداد العشرية (لمجموعة المتابعة).</w:t>
       </w:r>
     </w:p>
     <w:p>
@@ -6244,7 +6204,7 @@
           <w:szCs w:val="24"/>
           <w:rtl w:val="1"/>
         </w:rPr>
-        <w:t xml:space="preserve">4- الهدف 3 (الكسر العشري): </w:t>
+        <w:t xml:space="preserve">4- </w:t>
       </w:r>
       <w:r>
         <w:rPr>
@@ -6252,37 +6212,7 @@
           <w:szCs w:val="24"/>
           <w:rtl w:val="1"/>
         </w:rPr>
-        <w:t xml:space="preserve">تمارين على كتابة العدد العشري على شكل كسر مقامه 10 أو 100 أو 1000، للتلاميذ: فضل، مريم، فاطمة.</w:t>
-      </w:r>
-    </w:p>
-    <w:p>
-      <w:pPr>
-        <w:bidi w:val="1"/>
-        <w:spacing w:after="60" w:line="276" w:lineRule="auto"/>
-        <w:ind w:left="-180" w:right="180" w:firstLine="0"/>
-        <w:jc w:val="both"/>
-        <w:rPr>
-          <w:sz w:val="24"/>
-          <w:szCs w:val="24"/>
-        </w:rPr>
-      </w:pPr>
-      <w:r>
-        <w:rPr>
-          <w:b w:val="1"/>
-          <w:bCs w:val="1"/>
-          <w:sz w:val="24"/>
-          <w:szCs w:val="24"/>
-          <w:rtl w:val="1"/>
-        </w:rPr>
-        <w:t xml:space="preserve">5- متابعة فردية وإثراء: </w:t>
-      </w:r>
-      <w:r>
-        <w:rPr>
-          <w:sz w:val="24"/>
-          <w:szCs w:val="24"/>
-          <w:rtl w:val="1"/>
-        </w:rPr>
-        <w:t xml:space="preserve">متابعة فردية لفاطمة فردون وفضل ملك، وأنشطة إثرائية لخليل واحمد مع إشراكهما في تعلّم الأقران.</w:t>
+        <w:t xml:space="preserve">أنشطة إثرائية للمتمكّنين وإشراكهم في تعلّم الأقران.</w:t>
       </w:r>
     </w:p>
     <w:p>

</xml_diff>